<commit_message>
fix: update formatting in Asset Accountability Form for clarity
</commit_message>
<xml_diff>
--- a/public/src/AccountabilityForms/ASSET ACCOUNTABILITY FORM - NEW ISSUE.docx
+++ b/public/src/AccountabilityForms/ASSET ACCOUNTABILITY FORM - NEW ISSUE.docx
@@ -6,13 +6,26 @@
       <w:pPr>
         <w:jc w:val="center"/>
         <w:rPr>
+          <w:rFonts w:ascii="Glacial Indifference" w:hAnsi="Glacial Indifference"/>
           <w:b/>
           <w:bCs/>
           <w:u w:val="single"/>
         </w:rPr>
       </w:pPr>
-      <w:r>
-        <w:rPr>
+    </w:p>
+    <w:p>
+      <w:pPr>
+        <w:jc w:val="center"/>
+        <w:rPr>
+          <w:rFonts w:ascii="Glacial Indifference" w:hAnsi="Glacial Indifference"/>
+          <w:b/>
+          <w:bCs/>
+          <w:u w:val="single"/>
+        </w:rPr>
+      </w:pPr>
+      <w:r>
+        <w:rPr>
+          <w:rFonts w:ascii="Glacial Indifference" w:hAnsi="Glacial Indifference"/>
           <w:b/>
           <w:bCs/>
           <w:u w:val="single"/>
@@ -24,33 +37,19 @@
       <w:pPr>
         <w:jc w:val="both"/>
         <w:rPr>
+          <w:rFonts w:ascii="Glacial Indifference" w:hAnsi="Glacial Indifference"/>
           <w:b/>
           <w:color w:val="FF0000"/>
         </w:rPr>
       </w:pPr>
       <w:r>
         <w:rPr>
-          <w:b/>
-          <w:bCs/>
-        </w:rPr>
-        <w:t>Please com</w:t>
-      </w:r>
-      <w:r>
-        <w:rPr>
-          <w:b/>
-          <w:bCs/>
-        </w:rPr>
-        <w:t>plete the following form upon receipt of any company equipment. A copy of this form will be kept in your personal file.</w:t>
-      </w:r>
-    </w:p>
-    <w:p>
-      <w:pPr>
-        <w:jc w:val="both"/>
-        <w:rPr>
-          <w:b/>
-          <w:bCs/>
-        </w:rPr>
-      </w:pPr>
+          <w:rFonts w:ascii="Glacial Indifference" w:hAnsi="Glacial Indifference"/>
+          <w:b/>
+          <w:bCs/>
+        </w:rPr>
+        <w:t>Please complete the following form upon receipt of any company equipment. A copy of this form will be kept in your personal file.</w:t>
+      </w:r>
     </w:p>
     <w:p>
       <w:pPr>
@@ -59,6 +58,7 @@
           <w:tab w:val="center" w:pos="5836"/>
         </w:tabs>
         <w:rPr>
+          <w:rFonts w:ascii="Glacial Indifference" w:hAnsi="Glacial Indifference"/>
           <w:b/>
           <w:bCs/>
           <w:sz w:val="24"/>
@@ -67,42 +67,51 @@
       </w:pPr>
       <w:r>
         <w:rPr>
+          <w:rFonts w:ascii="Glacial Indifference" w:hAnsi="Glacial Indifference"/>
           <w:b/>
           <w:bCs/>
           <w:sz w:val="24"/>
           <w:szCs w:val="24"/>
         </w:rPr>
-        <w:t>NEW ISSUE</w:t>
-      </w:r>
-      <w:r>
-        <w:rPr>
+        <w:t xml:space="preserve">NEW ISSUE:  </w:t>
+      </w:r>
+      <w:proofErr w:type="gramStart"/>
+      <w:r>
+        <w:rPr>
+          <w:rFonts w:ascii="Glacial Indifference" w:hAnsi="Glacial Indifference"/>
           <w:b/>
           <w:bCs/>
           <w:sz w:val="24"/>
           <w:szCs w:val="24"/>
         </w:rPr>
-        <w:t xml:space="preserve">:     </w:t>
-      </w:r>
-      <w:r>
-        <w:rPr>
+        <w:t xml:space="preserve">   </w:t>
+      </w:r>
+      <w:r>
+        <w:rPr>
+          <w:rFonts w:ascii="Glacial Indifference" w:hAnsi="Glacial Indifference"/>
           <w:b/>
           <w:bCs/>
           <w:sz w:val="24"/>
           <w:szCs w:val="24"/>
         </w:rPr>
-        <w:t>{newIssueNewBox</w:t>
-      </w:r>
-      <w:r>
-        <w:rPr>
+        <w:t>{</w:t>
+      </w:r>
+      <w:proofErr w:type="spellStart"/>
+      <w:proofErr w:type="gramEnd"/>
+      <w:r>
+        <w:rPr>
+          <w:rFonts w:ascii="Glacial Indifference" w:hAnsi="Glacial Indifference"/>
           <w:b/>
           <w:bCs/>
           <w:sz w:val="24"/>
           <w:szCs w:val="24"/>
         </w:rPr>
-        <w:t>Black</w:t>
-      </w:r>
-      <w:r>
-        <w:rPr>
+        <w:t>newIssueNewBoxBlack</w:t>
+      </w:r>
+      <w:proofErr w:type="spellEnd"/>
+      <w:r>
+        <w:rPr>
+          <w:rFonts w:ascii="Glacial Indifference" w:hAnsi="Glacial Indifference"/>
           <w:b/>
           <w:bCs/>
           <w:sz w:val="24"/>
@@ -112,36 +121,53 @@
       </w:r>
       <w:r>
         <w:rPr>
+          <w:rFonts w:ascii="Glacial Indifference" w:hAnsi="Glacial Indifference"/>
           <w:b/>
           <w:bCs/>
           <w:color w:val="EE0000"/>
           <w:sz w:val="28"/>
           <w:szCs w:val="28"/>
         </w:rPr>
-        <w:t>{newIssueNewBox</w:t>
-      </w:r>
-      <w:r>
-        <w:rPr>
+        <w:t>{</w:t>
+      </w:r>
+      <w:proofErr w:type="spellStart"/>
+      <w:r>
+        <w:rPr>
+          <w:rFonts w:ascii="Glacial Indifference" w:hAnsi="Glacial Indifference"/>
           <w:b/>
           <w:bCs/>
           <w:color w:val="EE0000"/>
           <w:sz w:val="28"/>
           <w:szCs w:val="28"/>
         </w:rPr>
-        <w:t>Red</w:t>
-      </w:r>
-      <w:r>
-        <w:rPr>
+        <w:t>newIssueNewBox</w:t>
+      </w:r>
+      <w:r>
+        <w:rPr>
+          <w:rFonts w:ascii="Glacial Indifference" w:hAnsi="Glacial Indifference"/>
           <w:b/>
           <w:bCs/>
           <w:color w:val="EE0000"/>
           <w:sz w:val="28"/>
           <w:szCs w:val="28"/>
         </w:rPr>
+        <w:t>Red</w:t>
+      </w:r>
+      <w:proofErr w:type="spellEnd"/>
+      <w:r>
+        <w:rPr>
+          <w:rFonts w:ascii="Glacial Indifference" w:hAnsi="Glacial Indifference"/>
+          <w:b/>
+          <w:bCs/>
+          <w:color w:val="EE0000"/>
+          <w:sz w:val="28"/>
+          <w:szCs w:val="28"/>
+        </w:rPr>
         <w:t>}</w:t>
       </w:r>
       <w:r>
         <w:rPr>
+          <w:rFonts w:ascii="Glacial Indifference" w:hAnsi="Glacial Indifference"/>
           <w:b/>
           <w:bCs/>
           <w:color w:val="EE0000"/>
@@ -152,42 +178,50 @@
       </w:r>
       <w:r>
         <w:rPr>
+          <w:rFonts w:ascii="Glacial Indifference" w:hAnsi="Glacial Indifference"/>
           <w:b/>
           <w:bCs/>
           <w:sz w:val="24"/>
           <w:szCs w:val="24"/>
         </w:rPr>
-        <w:t xml:space="preserve">NEWLY PURCHASED        </w:t>
-      </w:r>
-      <w:r>
-        <w:rPr>
+        <w:t xml:space="preserve">NEWLY PURCHASED     </w:t>
+      </w:r>
+      <w:proofErr w:type="gramStart"/>
+      <w:r>
+        <w:rPr>
+          <w:rFonts w:ascii="Glacial Indifference" w:hAnsi="Glacial Indifference"/>
           <w:b/>
           <w:bCs/>
           <w:sz w:val="24"/>
           <w:szCs w:val="24"/>
         </w:rPr>
-        <w:t>{newIssue</w:t>
-      </w:r>
-      <w:r>
-        <w:rPr>
+        <w:t xml:space="preserve">   </w:t>
+      </w:r>
+      <w:r>
+        <w:rPr>
+          <w:rFonts w:ascii="Glacial Indifference" w:hAnsi="Glacial Indifference"/>
           <w:b/>
           <w:bCs/>
           <w:sz w:val="24"/>
           <w:szCs w:val="24"/>
         </w:rPr>
-        <w:t>Stock</w:t>
-      </w:r>
-      <w:r>
-        <w:rPr>
+        <w:t>{</w:t>
+      </w:r>
+      <w:proofErr w:type="spellStart"/>
+      <w:proofErr w:type="gramEnd"/>
+      <w:r>
+        <w:rPr>
+          <w:rFonts w:ascii="Glacial Indifference" w:hAnsi="Glacial Indifference"/>
           <w:b/>
           <w:bCs/>
           <w:sz w:val="24"/>
           <w:szCs w:val="24"/>
         </w:rPr>
-        <w:t>Box</w:t>
-      </w:r>
-      <w:r>
-        <w:rPr>
+        <w:t>newIssueStockBox</w:t>
+      </w:r>
+      <w:r>
+        <w:rPr>
+          <w:rFonts w:ascii="Glacial Indifference" w:hAnsi="Glacial Indifference"/>
           <w:b/>
           <w:bCs/>
           <w:sz w:val="24"/>
@@ -195,8 +229,10 @@
         </w:rPr>
         <w:t>Black</w:t>
       </w:r>
-      <w:r>
-        <w:rPr>
+      <w:proofErr w:type="spellEnd"/>
+      <w:r>
+        <w:rPr>
+          <w:rFonts w:ascii="Glacial Indifference" w:hAnsi="Glacial Indifference"/>
           <w:b/>
           <w:bCs/>
           <w:sz w:val="24"/>
@@ -206,6 +242,7 @@
       </w:r>
       <w:r>
         <w:rPr>
+          <w:rFonts w:ascii="Glacial Indifference" w:hAnsi="Glacial Indifference"/>
           <w:b/>
           <w:bCs/>
           <w:sz w:val="24"/>
@@ -215,16 +252,42 @@
       </w:r>
       <w:r>
         <w:rPr>
+          <w:rFonts w:ascii="Glacial Indifference" w:hAnsi="Glacial Indifference"/>
           <w:b/>
           <w:bCs/>
           <w:color w:val="EE0000"/>
           <w:sz w:val="28"/>
           <w:szCs w:val="28"/>
         </w:rPr>
-        <w:t>{newIssueStockBoxRed}</w:t>
-      </w:r>
-      <w:r>
-        <w:rPr>
+        <w:t>{</w:t>
+      </w:r>
+      <w:proofErr w:type="spellStart"/>
+      <w:r>
+        <w:rPr>
+          <w:rFonts w:ascii="Glacial Indifference" w:hAnsi="Glacial Indifference"/>
+          <w:b/>
+          <w:bCs/>
+          <w:color w:val="EE0000"/>
+          <w:sz w:val="28"/>
+          <w:szCs w:val="28"/>
+        </w:rPr>
+        <w:t>newIssueStockBoxRed</w:t>
+      </w:r>
+      <w:proofErr w:type="spellEnd"/>
+      <w:r>
+        <w:rPr>
+          <w:rFonts w:ascii="Glacial Indifference" w:hAnsi="Glacial Indifference"/>
+          <w:b/>
+          <w:bCs/>
+          <w:color w:val="EE0000"/>
+          <w:sz w:val="28"/>
+          <w:szCs w:val="28"/>
+        </w:rPr>
+        <w:t>}</w:t>
+      </w:r>
+      <w:r>
+        <w:rPr>
+          <w:rFonts w:ascii="Glacial Indifference" w:hAnsi="Glacial Indifference"/>
           <w:b/>
           <w:bCs/>
           <w:sz w:val="24"/>
@@ -240,6 +303,7 @@
           <w:tab w:val="center" w:pos="5836"/>
         </w:tabs>
         <w:rPr>
+          <w:rFonts w:ascii="Glacial Indifference" w:hAnsi="Glacial Indifference"/>
           <w:b/>
           <w:bCs/>
           <w:sz w:val="24"/>
@@ -248,42 +312,50 @@
       </w:pPr>
       <w:r>
         <w:rPr>
+          <w:rFonts w:ascii="Glacial Indifference" w:hAnsi="Glacial Indifference"/>
           <w:b/>
           <w:bCs/>
           <w:sz w:val="24"/>
           <w:szCs w:val="24"/>
         </w:rPr>
-        <w:t xml:space="preserve">WORK FROM HOME/BORROWED:   </w:t>
-      </w:r>
-      <w:r>
-        <w:rPr>
+        <w:t>WORK FROM HOME/BORROWED:</w:t>
+      </w:r>
+      <w:proofErr w:type="gramStart"/>
+      <w:r>
+        <w:rPr>
+          <w:rFonts w:ascii="Glacial Indifference" w:hAnsi="Glacial Indifference"/>
           <w:b/>
           <w:bCs/>
           <w:sz w:val="24"/>
           <w:szCs w:val="24"/>
         </w:rPr>
-        <w:t>{</w:t>
-      </w:r>
-      <w:r>
-        <w:rPr>
+        <w:t xml:space="preserve">   </w:t>
+      </w:r>
+      <w:r>
+        <w:rPr>
+          <w:rFonts w:ascii="Glacial Indifference" w:hAnsi="Glacial Indifference"/>
           <w:b/>
           <w:bCs/>
           <w:sz w:val="24"/>
           <w:szCs w:val="24"/>
         </w:rPr>
-        <w:t>wfh</w:t>
-      </w:r>
-      <w:r>
-        <w:rPr>
+        <w:t>{</w:t>
+      </w:r>
+      <w:proofErr w:type="spellStart"/>
+      <w:proofErr w:type="gramEnd"/>
+      <w:r>
+        <w:rPr>
+          <w:rFonts w:ascii="Glacial Indifference" w:hAnsi="Glacial Indifference"/>
           <w:b/>
           <w:bCs/>
           <w:sz w:val="24"/>
           <w:szCs w:val="24"/>
         </w:rPr>
-        <w:t>NewBox</w:t>
-      </w:r>
-      <w:r>
-        <w:rPr>
+        <w:t>wfhNewBox</w:t>
+      </w:r>
+      <w:r>
+        <w:rPr>
+          <w:rFonts w:ascii="Glacial Indifference" w:hAnsi="Glacial Indifference"/>
           <w:b/>
           <w:bCs/>
           <w:sz w:val="24"/>
@@ -291,8 +363,10 @@
         </w:rPr>
         <w:t>Black</w:t>
       </w:r>
-      <w:r>
-        <w:rPr>
+      <w:proofErr w:type="spellEnd"/>
+      <w:r>
+        <w:rPr>
+          <w:rFonts w:ascii="Glacial Indifference" w:hAnsi="Glacial Indifference"/>
           <w:b/>
           <w:bCs/>
           <w:sz w:val="24"/>
@@ -302,109 +376,185 @@
       </w:r>
       <w:r>
         <w:rPr>
+          <w:rFonts w:ascii="Glacial Indifference" w:hAnsi="Glacial Indifference"/>
           <w:b/>
           <w:bCs/>
           <w:color w:val="EE0000"/>
           <w:sz w:val="28"/>
           <w:szCs w:val="28"/>
         </w:rPr>
-        <w:t>{wfhNewBoxRed}</w:t>
-      </w:r>
-      <w:r>
-        <w:rPr>
-          <w:b/>
-          <w:bCs/>
-          <w:sz w:val="24"/>
-          <w:szCs w:val="24"/>
-        </w:rPr>
-        <w:t xml:space="preserve">  NEWLY PURCHASED  </w:t>
-      </w:r>
-      <w:r>
-        <w:rPr>
-          <w:b/>
-          <w:bCs/>
-          <w:sz w:val="24"/>
-          <w:szCs w:val="24"/>
-        </w:rPr>
         <w:t>{</w:t>
       </w:r>
-      <w:r>
-        <w:rPr>
-          <w:b/>
-          <w:bCs/>
-          <w:sz w:val="24"/>
-          <w:szCs w:val="24"/>
-        </w:rPr>
-        <w:t>wfhStock</w:t>
-      </w:r>
-      <w:r>
-        <w:rPr>
-          <w:b/>
-          <w:bCs/>
-          <w:sz w:val="24"/>
-          <w:szCs w:val="24"/>
-        </w:rPr>
-        <w:t>Box</w:t>
-      </w:r>
-      <w:r>
-        <w:rPr>
-          <w:b/>
-          <w:bCs/>
-          <w:sz w:val="24"/>
-          <w:szCs w:val="24"/>
-        </w:rPr>
-        <w:t>Black</w:t>
-      </w:r>
-      <w:r>
-        <w:rPr>
-          <w:b/>
-          <w:bCs/>
-          <w:sz w:val="24"/>
-          <w:szCs w:val="24"/>
-        </w:rPr>
-        <w:t>}</w:t>
-      </w:r>
-      <w:r>
-        <w:rPr>
-          <w:b/>
-          <w:bCs/>
-          <w:sz w:val="24"/>
-          <w:szCs w:val="24"/>
-        </w:rPr>
-        <w:t xml:space="preserve"> </w:t>
-      </w:r>
-      <w:r>
-        <w:rPr>
+      <w:proofErr w:type="spellStart"/>
+      <w:proofErr w:type="gramStart"/>
+      <w:r>
+        <w:rPr>
+          <w:rFonts w:ascii="Glacial Indifference" w:hAnsi="Glacial Indifference"/>
           <w:b/>
           <w:bCs/>
           <w:color w:val="EE0000"/>
           <w:sz w:val="28"/>
           <w:szCs w:val="28"/>
         </w:rPr>
-        <w:t>{wfhStock</w:t>
-      </w:r>
-      <w:r>
-        <w:rPr>
+        <w:t>wfhNewBoxRed</w:t>
+      </w:r>
+      <w:proofErr w:type="spellEnd"/>
+      <w:r>
+        <w:rPr>
+          <w:rFonts w:ascii="Glacial Indifference" w:hAnsi="Glacial Indifference"/>
           <w:b/>
           <w:bCs/>
           <w:color w:val="EE0000"/>
           <w:sz w:val="28"/>
           <w:szCs w:val="28"/>
         </w:rPr>
-        <w:t>Box</w:t>
-      </w:r>
-      <w:r>
-        <w:rPr>
+        <w:t>}</w:t>
+      </w:r>
+      <w:r>
+        <w:rPr>
+          <w:rFonts w:ascii="Glacial Indifference" w:hAnsi="Glacial Indifference"/>
+          <w:b/>
+          <w:bCs/>
+          <w:sz w:val="24"/>
+          <w:szCs w:val="24"/>
+        </w:rPr>
+        <w:t xml:space="preserve">  NEWLY</w:t>
+      </w:r>
+      <w:proofErr w:type="gramEnd"/>
+      <w:r>
+        <w:rPr>
+          <w:rFonts w:ascii="Glacial Indifference" w:hAnsi="Glacial Indifference"/>
+          <w:b/>
+          <w:bCs/>
+          <w:sz w:val="24"/>
+          <w:szCs w:val="24"/>
+        </w:rPr>
+        <w:t xml:space="preserve"> </w:t>
+      </w:r>
+      <w:proofErr w:type="gramStart"/>
+      <w:r>
+        <w:rPr>
+          <w:rFonts w:ascii="Glacial Indifference" w:hAnsi="Glacial Indifference"/>
+          <w:b/>
+          <w:bCs/>
+          <w:sz w:val="24"/>
+          <w:szCs w:val="24"/>
+        </w:rPr>
+        <w:t xml:space="preserve">PURCHASED  </w:t>
+      </w:r>
+      <w:r>
+        <w:rPr>
+          <w:rFonts w:ascii="Glacial Indifference" w:hAnsi="Glacial Indifference"/>
+          <w:b/>
+          <w:bCs/>
+          <w:sz w:val="24"/>
+          <w:szCs w:val="24"/>
+        </w:rPr>
+        <w:t>{</w:t>
+      </w:r>
+      <w:proofErr w:type="spellStart"/>
+      <w:proofErr w:type="gramEnd"/>
+      <w:r>
+        <w:rPr>
+          <w:rFonts w:ascii="Glacial Indifference" w:hAnsi="Glacial Indifference"/>
+          <w:b/>
+          <w:bCs/>
+          <w:sz w:val="24"/>
+          <w:szCs w:val="24"/>
+        </w:rPr>
+        <w:t>wfhStockBox</w:t>
+      </w:r>
+      <w:r>
+        <w:rPr>
+          <w:rFonts w:ascii="Glacial Indifference" w:hAnsi="Glacial Indifference"/>
+          <w:b/>
+          <w:bCs/>
+          <w:sz w:val="24"/>
+          <w:szCs w:val="24"/>
+        </w:rPr>
+        <w:t>Black</w:t>
+      </w:r>
+      <w:proofErr w:type="spellEnd"/>
+      <w:r>
+        <w:rPr>
+          <w:rFonts w:ascii="Glacial Indifference" w:hAnsi="Glacial Indifference"/>
+          <w:b/>
+          <w:bCs/>
+          <w:sz w:val="24"/>
+          <w:szCs w:val="24"/>
+        </w:rPr>
+        <w:t>}</w:t>
+      </w:r>
+      <w:r>
+        <w:rPr>
+          <w:rFonts w:ascii="Glacial Indifference" w:hAnsi="Glacial Indifference"/>
+          <w:b/>
+          <w:bCs/>
+          <w:sz w:val="24"/>
+          <w:szCs w:val="24"/>
+        </w:rPr>
+        <w:t xml:space="preserve"> </w:t>
+      </w:r>
+      <w:r>
+        <w:rPr>
+          <w:rFonts w:ascii="Glacial Indifference" w:hAnsi="Glacial Indifference"/>
           <w:b/>
           <w:bCs/>
           <w:color w:val="EE0000"/>
           <w:sz w:val="28"/>
           <w:szCs w:val="28"/>
         </w:rPr>
-        <w:t>Red}</w:t>
-      </w:r>
-      <w:r>
-        <w:rPr>
+        <w:t>{</w:t>
+      </w:r>
+      <w:proofErr w:type="spellStart"/>
+      <w:r>
+        <w:rPr>
+          <w:rFonts w:ascii="Glacial Indifference" w:hAnsi="Glacial Indifference"/>
+          <w:b/>
+          <w:bCs/>
+          <w:color w:val="EE0000"/>
+          <w:sz w:val="28"/>
+          <w:szCs w:val="28"/>
+        </w:rPr>
+        <w:t>wfhStock</w:t>
+      </w:r>
+      <w:r>
+        <w:rPr>
+          <w:rFonts w:ascii="Glacial Indifference" w:hAnsi="Glacial Indifference"/>
+          <w:b/>
+          <w:bCs/>
+          <w:color w:val="EE0000"/>
+          <w:sz w:val="28"/>
+          <w:szCs w:val="28"/>
+        </w:rPr>
+        <w:t>Box</w:t>
+      </w:r>
+      <w:r>
+        <w:rPr>
+          <w:rFonts w:ascii="Glacial Indifference" w:hAnsi="Glacial Indifference"/>
+          <w:b/>
+          <w:bCs/>
+          <w:color w:val="EE0000"/>
+          <w:sz w:val="28"/>
+          <w:szCs w:val="28"/>
+        </w:rPr>
+        <w:t>Red</w:t>
+      </w:r>
+      <w:proofErr w:type="spellEnd"/>
+      <w:r>
+        <w:rPr>
+          <w:rFonts w:ascii="Glacial Indifference" w:hAnsi="Glacial Indifference"/>
+          <w:b/>
+          <w:bCs/>
+          <w:color w:val="EE0000"/>
+          <w:sz w:val="28"/>
+          <w:szCs w:val="28"/>
+        </w:rPr>
+        <w:t>}</w:t>
+      </w:r>
+      <w:r>
+        <w:rPr>
+          <w:rFonts w:ascii="Glacial Indifference" w:hAnsi="Glacial Indifference"/>
           <w:b/>
           <w:bCs/>
           <w:sz w:val="24"/>
@@ -414,6 +564,7 @@
       </w:r>
       <w:r>
         <w:rPr>
+          <w:rFonts w:ascii="Glacial Indifference" w:hAnsi="Glacial Indifference"/>
           <w:b/>
           <w:bCs/>
           <w:sz w:val="24"/>
@@ -425,6 +576,7 @@
     <w:p>
       <w:pPr>
         <w:rPr>
+          <w:rFonts w:ascii="Glacial Indifference" w:hAnsi="Glacial Indifference"/>
           <w:b/>
           <w:bCs/>
           <w:sz w:val="24"/>
@@ -443,8 +595,8 @@
       </w:tblPr>
       <w:tblGrid>
         <w:gridCol w:w="2037"/>
-        <w:gridCol w:w="3066"/>
-        <w:gridCol w:w="2410"/>
+        <w:gridCol w:w="2861"/>
+        <w:gridCol w:w="2615"/>
         <w:gridCol w:w="3827"/>
       </w:tblGrid>
       <w:tr>
@@ -458,12 +610,14 @@
           <w:p>
             <w:pPr>
               <w:rPr>
+                <w:rFonts w:ascii="Glacial Indifference" w:hAnsi="Glacial Indifference"/>
                 <w:b/>
                 <w:bCs/>
               </w:rPr>
             </w:pPr>
             <w:r>
               <w:rPr>
+                <w:rFonts w:ascii="Glacial Indifference" w:hAnsi="Glacial Indifference"/>
                 <w:b/>
                 <w:bCs/>
               </w:rPr>
@@ -471,6 +625,7 @@
             </w:r>
             <w:r>
               <w:rPr>
+                <w:rFonts w:ascii="Glacial Indifference" w:hAnsi="Glacial Indifference"/>
                 <w:noProof/>
               </w:rPr>
               <w:t xml:space="preserve"> </w:t>
@@ -479,50 +634,44 @@
         </w:tc>
         <w:tc>
           <w:tcPr>
-            <w:tcW w:w="3066" w:type="dxa"/>
+            <w:tcW w:w="2861" w:type="dxa"/>
           </w:tcPr>
           <w:p>
             <w:pPr>
               <w:tabs>
                 <w:tab w:val="center" w:pos="1425"/>
               </w:tabs>
-            </w:pPr>
-            <w:r>
+              <w:rPr>
+                <w:rFonts w:ascii="Glacial Indifference" w:hAnsi="Glacial Indifference"/>
+              </w:rPr>
+            </w:pPr>
+            <w:r>
+              <w:rPr>
+                <w:rFonts w:ascii="Glacial Indifference" w:hAnsi="Glacial Indifference"/>
+              </w:rPr>
               <w:t>{name}</w:t>
             </w:r>
           </w:p>
         </w:tc>
         <w:tc>
           <w:tcPr>
-            <w:tcW w:w="2410" w:type="dxa"/>
-          </w:tcPr>
-          <w:p>
-            <w:pPr>
-              <w:rPr>
+            <w:tcW w:w="2615" w:type="dxa"/>
+          </w:tcPr>
+          <w:p>
+            <w:pPr>
+              <w:rPr>
+                <w:rFonts w:ascii="Glacial Indifference" w:hAnsi="Glacial Indifference"/>
                 <w:b/>
                 <w:bCs/>
               </w:rPr>
             </w:pPr>
             <w:r>
               <w:rPr>
+                <w:rFonts w:ascii="Glacial Indifference" w:hAnsi="Glacial Indifference"/>
                 <w:b/>
                 <w:bCs/>
               </w:rPr>
-              <w:t>DEPARTMENT</w:t>
-            </w:r>
-            <w:r>
-              <w:rPr>
-                <w:b/>
-                <w:bCs/>
-              </w:rPr>
-              <w:t>/CLIENT</w:t>
-            </w:r>
-            <w:r>
-              <w:rPr>
-                <w:b/>
-                <w:bCs/>
-              </w:rPr>
-              <w:t>:</w:t>
+              <w:t>DEPARTMENT/CLIENT:</w:t>
             </w:r>
           </w:p>
         </w:tc>
@@ -531,13 +680,27 @@
             <w:tcW w:w="3827" w:type="dxa"/>
           </w:tcPr>
           <w:p>
-            <w:r>
+            <w:pPr>
+              <w:rPr>
+                <w:rFonts w:ascii="Glacial Indifference" w:hAnsi="Glacial Indifference"/>
+              </w:rPr>
+            </w:pPr>
+            <w:r>
+              <w:rPr>
+                <w:rFonts w:ascii="Glacial Indifference" w:hAnsi="Glacial Indifference"/>
+              </w:rPr>
               <w:t>{</w:t>
             </w:r>
             <w:r>
+              <w:rPr>
+                <w:rFonts w:ascii="Glacial Indifference" w:hAnsi="Glacial Indifference"/>
+              </w:rPr>
               <w:t>department</w:t>
             </w:r>
             <w:r>
+              <w:rPr>
+                <w:rFonts w:ascii="Glacial Indifference" w:hAnsi="Glacial Indifference"/>
+              </w:rPr>
               <w:t>}</w:t>
             </w:r>
           </w:p>
@@ -554,12 +717,14 @@
           <w:p>
             <w:pPr>
               <w:rPr>
+                <w:rFonts w:ascii="Glacial Indifference" w:hAnsi="Glacial Indifference"/>
                 <w:b/>
                 <w:bCs/>
               </w:rPr>
             </w:pPr>
             <w:r>
               <w:rPr>
+                <w:rFonts w:ascii="Glacial Indifference" w:hAnsi="Glacial Indifference"/>
                 <w:b/>
                 <w:bCs/>
               </w:rPr>
@@ -567,6 +732,7 @@
             </w:r>
             <w:r>
               <w:rPr>
+                <w:rFonts w:ascii="Glacial Indifference" w:hAnsi="Glacial Indifference"/>
                 <w:noProof/>
               </w:rPr>
               <w:t xml:space="preserve"> </w:t>
@@ -575,27 +741,51 @@
         </w:tc>
         <w:tc>
           <w:tcPr>
-            <w:tcW w:w="3066" w:type="dxa"/>
-          </w:tcPr>
-          <w:p>
-            <w:r>
-              <w:t>{dateHired}</w:t>
-            </w:r>
-          </w:p>
-        </w:tc>
-        <w:tc>
-          <w:tcPr>
-            <w:tcW w:w="2410" w:type="dxa"/>
-          </w:tcPr>
-          <w:p>
-            <w:pPr>
-              <w:rPr>
+            <w:tcW w:w="2861" w:type="dxa"/>
+          </w:tcPr>
+          <w:p>
+            <w:pPr>
+              <w:rPr>
+                <w:rFonts w:ascii="Glacial Indifference" w:hAnsi="Glacial Indifference"/>
+              </w:rPr>
+            </w:pPr>
+            <w:r>
+              <w:rPr>
+                <w:rFonts w:ascii="Glacial Indifference" w:hAnsi="Glacial Indifference"/>
+              </w:rPr>
+              <w:t>{</w:t>
+            </w:r>
+            <w:proofErr w:type="spellStart"/>
+            <w:r>
+              <w:rPr>
+                <w:rFonts w:ascii="Glacial Indifference" w:hAnsi="Glacial Indifference"/>
+              </w:rPr>
+              <w:t>dateHired</w:t>
+            </w:r>
+            <w:proofErr w:type="spellEnd"/>
+            <w:r>
+              <w:rPr>
+                <w:rFonts w:ascii="Glacial Indifference" w:hAnsi="Glacial Indifference"/>
+              </w:rPr>
+              <w:t>}</w:t>
+            </w:r>
+          </w:p>
+        </w:tc>
+        <w:tc>
+          <w:tcPr>
+            <w:tcW w:w="2615" w:type="dxa"/>
+          </w:tcPr>
+          <w:p>
+            <w:pPr>
+              <w:rPr>
+                <w:rFonts w:ascii="Glacial Indifference" w:hAnsi="Glacial Indifference"/>
                 <w:b/>
                 <w:bCs/>
               </w:rPr>
             </w:pPr>
             <w:r>
               <w:rPr>
+                <w:rFonts w:ascii="Glacial Indifference" w:hAnsi="Glacial Indifference"/>
                 <w:b/>
                 <w:bCs/>
               </w:rPr>
@@ -608,14 +798,28 @@
             <w:tcW w:w="3827" w:type="dxa"/>
           </w:tcPr>
           <w:p>
-            <w:r>
+            <w:pPr>
+              <w:rPr>
+                <w:rFonts w:ascii="Glacial Indifference" w:hAnsi="Glacial Indifference"/>
+              </w:rPr>
+            </w:pPr>
+            <w:r>
+              <w:rPr>
+                <w:rFonts w:ascii="Glacial Indifference" w:hAnsi="Glacial Indifference"/>
+              </w:rPr>
               <w:t>{position}</w:t>
             </w:r>
           </w:p>
         </w:tc>
       </w:tr>
     </w:tbl>
-    <w:p/>
+    <w:p>
+      <w:pPr>
+        <w:rPr>
+          <w:rFonts w:ascii="Glacial Indifference" w:hAnsi="Glacial Indifference"/>
+        </w:rPr>
+      </w:pPr>
+    </w:p>
     <w:tbl>
       <w:tblPr>
         <w:tblStyle w:val="TableGrid"/>
@@ -644,12 +848,14 @@
             <w:pPr>
               <w:jc w:val="center"/>
               <w:rPr>
+                <w:rFonts w:ascii="Glacial Indifference" w:hAnsi="Glacial Indifference"/>
                 <w:b/>
                 <w:bCs/>
               </w:rPr>
             </w:pPr>
             <w:r>
               <w:rPr>
+                <w:rFonts w:ascii="Glacial Indifference" w:hAnsi="Glacial Indifference"/>
                 <w:b/>
                 <w:bCs/>
               </w:rPr>
@@ -665,12 +871,14 @@
             <w:pPr>
               <w:jc w:val="center"/>
               <w:rPr>
+                <w:rFonts w:ascii="Glacial Indifference" w:hAnsi="Glacial Indifference"/>
                 <w:b/>
                 <w:bCs/>
               </w:rPr>
             </w:pPr>
             <w:r>
               <w:rPr>
+                <w:rFonts w:ascii="Glacial Indifference" w:hAnsi="Glacial Indifference"/>
                 <w:b/>
                 <w:bCs/>
               </w:rPr>
@@ -686,12 +894,14 @@
             <w:pPr>
               <w:jc w:val="center"/>
               <w:rPr>
+                <w:rFonts w:ascii="Glacial Indifference" w:hAnsi="Glacial Indifference"/>
                 <w:b/>
                 <w:bCs/>
               </w:rPr>
             </w:pPr>
             <w:r>
               <w:rPr>
+                <w:rFonts w:ascii="Glacial Indifference" w:hAnsi="Glacial Indifference"/>
                 <w:b/>
                 <w:bCs/>
               </w:rPr>
@@ -707,12 +917,14 @@
             <w:pPr>
               <w:jc w:val="center"/>
               <w:rPr>
+                <w:rFonts w:ascii="Glacial Indifference" w:hAnsi="Glacial Indifference"/>
                 <w:b/>
                 <w:bCs/>
               </w:rPr>
             </w:pPr>
             <w:r>
               <w:rPr>
+                <w:rFonts w:ascii="Glacial Indifference" w:hAnsi="Glacial Indifference"/>
                 <w:b/>
                 <w:bCs/>
               </w:rPr>
@@ -728,12 +940,14 @@
             <w:pPr>
               <w:jc w:val="center"/>
               <w:rPr>
+                <w:rFonts w:ascii="Glacial Indifference" w:hAnsi="Glacial Indifference"/>
                 <w:b/>
                 <w:bCs/>
               </w:rPr>
             </w:pPr>
             <w:r>
               <w:rPr>
+                <w:rFonts w:ascii="Glacial Indifference" w:hAnsi="Glacial Indifference"/>
                 <w:b/>
                 <w:bCs/>
               </w:rPr>
@@ -749,12 +963,14 @@
             <w:pPr>
               <w:jc w:val="center"/>
               <w:rPr>
+                <w:rFonts w:ascii="Glacial Indifference" w:hAnsi="Glacial Indifference"/>
                 <w:b/>
                 <w:bCs/>
               </w:rPr>
             </w:pPr>
             <w:r>
               <w:rPr>
+                <w:rFonts w:ascii="Glacial Indifference" w:hAnsi="Glacial Indifference"/>
                 <w:b/>
                 <w:bCs/>
               </w:rPr>
@@ -776,23 +992,44 @@
             <w:pPr>
               <w:jc w:val="center"/>
               <w:rPr>
+                <w:rFonts w:ascii="Glacial Indifference" w:hAnsi="Glacial Indifference"/>
                 <w:sz w:val="18"/>
                 <w:szCs w:val="18"/>
               </w:rPr>
             </w:pPr>
             <w:r>
               <w:rPr>
+                <w:rFonts w:ascii="Glacial Indifference" w:hAnsi="Glacial Indifference"/>
                 <w:sz w:val="16"/>
                 <w:szCs w:val="16"/>
               </w:rPr>
-              <w:t>{#devices}</w:t>
-            </w:r>
-            <w:r>
-              <w:rPr>
+              <w:t>{#</w:t>
+            </w:r>
+            <w:proofErr w:type="gramStart"/>
+            <w:r>
+              <w:rPr>
+                <w:rFonts w:ascii="Glacial Indifference" w:hAnsi="Glacial Indifference"/>
                 <w:sz w:val="16"/>
                 <w:szCs w:val="16"/>
               </w:rPr>
-              <w:t>{assignmentDate}</w:t>
+              <w:t>devices}</w:t>
+            </w:r>
+            <w:r>
+              <w:rPr>
+                <w:rFonts w:ascii="Glacial Indifference" w:hAnsi="Glacial Indifference"/>
+                <w:sz w:val="16"/>
+                <w:szCs w:val="16"/>
+              </w:rPr>
+              <w:t>{</w:t>
+            </w:r>
+            <w:proofErr w:type="gramEnd"/>
+            <w:r>
+              <w:rPr>
+                <w:rFonts w:ascii="Glacial Indifference" w:hAnsi="Glacial Indifference"/>
+                <w:sz w:val="16"/>
+                <w:szCs w:val="16"/>
+              </w:rPr>
+              <w:t>assignmentDate}</w:t>
             </w:r>
           </w:p>
         </w:tc>
@@ -804,9 +1041,29 @@
           <w:p>
             <w:pPr>
               <w:jc w:val="center"/>
-            </w:pPr>
-            <w:r>
-              <w:t>{deviceType}</w:t>
+              <w:rPr>
+                <w:rFonts w:ascii="Glacial Indifference" w:hAnsi="Glacial Indifference"/>
+              </w:rPr>
+            </w:pPr>
+            <w:r>
+              <w:rPr>
+                <w:rFonts w:ascii="Glacial Indifference" w:hAnsi="Glacial Indifference"/>
+              </w:rPr>
+              <w:t>{</w:t>
+            </w:r>
+            <w:proofErr w:type="spellStart"/>
+            <w:r>
+              <w:rPr>
+                <w:rFonts w:ascii="Glacial Indifference" w:hAnsi="Glacial Indifference"/>
+              </w:rPr>
+              <w:t>deviceType</w:t>
+            </w:r>
+            <w:proofErr w:type="spellEnd"/>
+            <w:r>
+              <w:rPr>
+                <w:rFonts w:ascii="Glacial Indifference" w:hAnsi="Glacial Indifference"/>
+              </w:rPr>
+              <w:t>}</w:t>
             </w:r>
           </w:p>
         </w:tc>
@@ -818,8 +1075,14 @@
           <w:p>
             <w:pPr>
               <w:jc w:val="center"/>
-            </w:pPr>
-            <w:r>
+              <w:rPr>
+                <w:rFonts w:ascii="Glacial Indifference" w:hAnsi="Glacial Indifference"/>
+              </w:rPr>
+            </w:pPr>
+            <w:r>
+              <w:rPr>
+                <w:rFonts w:ascii="Glacial Indifference" w:hAnsi="Glacial Indifference"/>
+              </w:rPr>
               <w:t>{brand}</w:t>
             </w:r>
           </w:p>
@@ -833,16 +1096,32 @@
             <w:pPr>
               <w:jc w:val="center"/>
               <w:rPr>
-                <w:rFonts w:ascii="Aptos Narrow" w:hAnsi="Aptos Narrow"/>
+                <w:rFonts w:ascii="Glacial Indifference" w:hAnsi="Glacial Indifference"/>
                 <w:color w:val="000000"/>
               </w:rPr>
             </w:pPr>
             <w:r>
               <w:rPr>
-                <w:rFonts w:ascii="Aptos Narrow" w:hAnsi="Aptos Narrow"/>
+                <w:rFonts w:ascii="Glacial Indifference" w:hAnsi="Glacial Indifference"/>
                 <w:color w:val="000000"/>
               </w:rPr>
-              <w:t>{deviceTag}</w:t>
+              <w:t>{</w:t>
+            </w:r>
+            <w:proofErr w:type="spellStart"/>
+            <w:r>
+              <w:rPr>
+                <w:rFonts w:ascii="Glacial Indifference" w:hAnsi="Glacial Indifference"/>
+                <w:color w:val="000000"/>
+              </w:rPr>
+              <w:t>deviceTag</w:t>
+            </w:r>
+            <w:proofErr w:type="spellEnd"/>
+            <w:r>
+              <w:rPr>
+                <w:rFonts w:ascii="Glacial Indifference" w:hAnsi="Glacial Indifference"/>
+                <w:color w:val="000000"/>
+              </w:rPr>
+              <w:t>}</w:t>
             </w:r>
           </w:p>
         </w:tc>
@@ -854,8 +1133,14 @@
           <w:p>
             <w:pPr>
               <w:jc w:val="center"/>
-            </w:pPr>
-            <w:r>
+              <w:rPr>
+                <w:rFonts w:ascii="Glacial Indifference" w:hAnsi="Glacial Indifference"/>
+              </w:rPr>
+            </w:pPr>
+            <w:r>
+              <w:rPr>
+                <w:rFonts w:ascii="Glacial Indifference" w:hAnsi="Glacial Indifference"/>
+              </w:rPr>
               <w:t>{condition}</w:t>
             </w:r>
           </w:p>
@@ -869,12 +1154,15 @@
             <w:pPr>
               <w:jc w:val="center"/>
               <w:rPr>
+                <w:rFonts w:ascii="Glacial Indifference" w:hAnsi="Glacial Indifference"/>
                 <w:sz w:val="18"/>
                 <w:szCs w:val="18"/>
               </w:rPr>
             </w:pPr>
-            <w:r>
-              <w:rPr>
+            <w:proofErr w:type="gramStart"/>
+            <w:r>
+              <w:rPr>
+                <w:rFonts w:ascii="Glacial Indifference" w:hAnsi="Glacial Indifference"/>
                 <w:sz w:val="18"/>
                 <w:szCs w:val="18"/>
               </w:rPr>
@@ -882,10 +1170,20 @@
             </w:r>
             <w:r>
               <w:rPr>
+                <w:rFonts w:ascii="Glacial Indifference" w:hAnsi="Glacial Indifference"/>
                 <w:sz w:val="18"/>
                 <w:szCs w:val="18"/>
               </w:rPr>
-              <w:t>{/devices}</w:t>
+              <w:t>{/</w:t>
+            </w:r>
+            <w:proofErr w:type="gramEnd"/>
+            <w:r>
+              <w:rPr>
+                <w:rFonts w:ascii="Glacial Indifference" w:hAnsi="Glacial Indifference"/>
+                <w:sz w:val="18"/>
+                <w:szCs w:val="18"/>
+              </w:rPr>
+              <w:t>devices}</w:t>
             </w:r>
           </w:p>
         </w:tc>
@@ -902,6 +1200,9 @@
           <w:p>
             <w:pPr>
               <w:jc w:val="center"/>
+              <w:rPr>
+                <w:rFonts w:ascii="Glacial Indifference" w:hAnsi="Glacial Indifference"/>
+              </w:rPr>
             </w:pPr>
           </w:p>
         </w:tc>
@@ -913,6 +1214,9 @@
           <w:p>
             <w:pPr>
               <w:jc w:val="center"/>
+              <w:rPr>
+                <w:rFonts w:ascii="Glacial Indifference" w:hAnsi="Glacial Indifference"/>
+              </w:rPr>
             </w:pPr>
           </w:p>
         </w:tc>
@@ -924,6 +1228,9 @@
           <w:p>
             <w:pPr>
               <w:jc w:val="center"/>
+              <w:rPr>
+                <w:rFonts w:ascii="Glacial Indifference" w:hAnsi="Glacial Indifference"/>
+              </w:rPr>
             </w:pPr>
           </w:p>
         </w:tc>
@@ -936,7 +1243,7 @@
             <w:pPr>
               <w:jc w:val="center"/>
               <w:rPr>
-                <w:rFonts w:ascii="Aptos Narrow" w:hAnsi="Aptos Narrow"/>
+                <w:rFonts w:ascii="Glacial Indifference" w:hAnsi="Glacial Indifference"/>
                 <w:color w:val="000000"/>
               </w:rPr>
             </w:pPr>
@@ -954,6 +1261,9 @@
                 <w:tab w:val="left" w:pos="1395"/>
               </w:tabs>
               <w:jc w:val="center"/>
+              <w:rPr>
+                <w:rFonts w:ascii="Glacial Indifference" w:hAnsi="Glacial Indifference"/>
+              </w:rPr>
             </w:pPr>
           </w:p>
         </w:tc>
@@ -966,6 +1276,7 @@
             <w:pPr>
               <w:jc w:val="center"/>
               <w:rPr>
+                <w:rFonts w:ascii="Glacial Indifference" w:hAnsi="Glacial Indifference"/>
                 <w:sz w:val="20"/>
                 <w:szCs w:val="20"/>
               </w:rPr>
@@ -985,6 +1296,9 @@
           <w:p>
             <w:pPr>
               <w:jc w:val="center"/>
+              <w:rPr>
+                <w:rFonts w:ascii="Glacial Indifference" w:hAnsi="Glacial Indifference"/>
+              </w:rPr>
             </w:pPr>
           </w:p>
         </w:tc>
@@ -996,6 +1310,9 @@
           <w:p>
             <w:pPr>
               <w:jc w:val="center"/>
+              <w:rPr>
+                <w:rFonts w:ascii="Glacial Indifference" w:hAnsi="Glacial Indifference"/>
+              </w:rPr>
             </w:pPr>
           </w:p>
         </w:tc>
@@ -1007,6 +1324,9 @@
           <w:p>
             <w:pPr>
               <w:jc w:val="center"/>
+              <w:rPr>
+                <w:rFonts w:ascii="Glacial Indifference" w:hAnsi="Glacial Indifference"/>
+              </w:rPr>
             </w:pPr>
           </w:p>
         </w:tc>
@@ -1019,7 +1339,7 @@
             <w:pPr>
               <w:jc w:val="center"/>
               <w:rPr>
-                <w:rFonts w:ascii="Aptos Narrow" w:hAnsi="Aptos Narrow"/>
+                <w:rFonts w:ascii="Glacial Indifference" w:hAnsi="Glacial Indifference"/>
                 <w:color w:val="000000"/>
               </w:rPr>
             </w:pPr>
@@ -1034,6 +1354,7 @@
             <w:pPr>
               <w:jc w:val="center"/>
               <w:rPr>
+                <w:rFonts w:ascii="Glacial Indifference" w:hAnsi="Glacial Indifference"/>
                 <w:sz w:val="18"/>
                 <w:szCs w:val="18"/>
               </w:rPr>
@@ -1049,6 +1370,7 @@
             <w:pPr>
               <w:jc w:val="center"/>
               <w:rPr>
+                <w:rFonts w:ascii="Glacial Indifference" w:hAnsi="Glacial Indifference"/>
                 <w:sz w:val="20"/>
                 <w:szCs w:val="20"/>
               </w:rPr>
@@ -1068,6 +1390,9 @@
           <w:p>
             <w:pPr>
               <w:jc w:val="center"/>
+              <w:rPr>
+                <w:rFonts w:ascii="Glacial Indifference" w:hAnsi="Glacial Indifference"/>
+              </w:rPr>
             </w:pPr>
           </w:p>
         </w:tc>
@@ -1082,6 +1407,9 @@
                 <w:tab w:val="left" w:pos="322"/>
               </w:tabs>
               <w:jc w:val="center"/>
+              <w:rPr>
+                <w:rFonts w:ascii="Glacial Indifference" w:hAnsi="Glacial Indifference"/>
+              </w:rPr>
             </w:pPr>
           </w:p>
         </w:tc>
@@ -1093,6 +1421,9 @@
           <w:p>
             <w:pPr>
               <w:jc w:val="center"/>
+              <w:rPr>
+                <w:rFonts w:ascii="Glacial Indifference" w:hAnsi="Glacial Indifference"/>
+              </w:rPr>
             </w:pPr>
           </w:p>
         </w:tc>
@@ -1105,7 +1436,7 @@
             <w:pPr>
               <w:jc w:val="center"/>
               <w:rPr>
-                <w:rFonts w:ascii="Aptos Narrow" w:hAnsi="Aptos Narrow"/>
+                <w:rFonts w:ascii="Glacial Indifference" w:hAnsi="Glacial Indifference"/>
                 <w:color w:val="000000"/>
               </w:rPr>
             </w:pPr>
@@ -1120,6 +1451,7 @@
             <w:pPr>
               <w:jc w:val="center"/>
               <w:rPr>
+                <w:rFonts w:ascii="Glacial Indifference" w:hAnsi="Glacial Indifference"/>
                 <w:sz w:val="18"/>
                 <w:szCs w:val="18"/>
               </w:rPr>
@@ -1135,6 +1467,7 @@
             <w:pPr>
               <w:jc w:val="center"/>
               <w:rPr>
+                <w:rFonts w:ascii="Glacial Indifference" w:hAnsi="Glacial Indifference"/>
                 <w:sz w:val="20"/>
                 <w:szCs w:val="20"/>
               </w:rPr>
@@ -1154,6 +1487,9 @@
           <w:p>
             <w:pPr>
               <w:jc w:val="center"/>
+              <w:rPr>
+                <w:rFonts w:ascii="Glacial Indifference" w:hAnsi="Glacial Indifference"/>
+              </w:rPr>
             </w:pPr>
           </w:p>
         </w:tc>
@@ -1168,6 +1504,9 @@
                 <w:tab w:val="left" w:pos="290"/>
               </w:tabs>
               <w:jc w:val="center"/>
+              <w:rPr>
+                <w:rFonts w:ascii="Glacial Indifference" w:hAnsi="Glacial Indifference"/>
+              </w:rPr>
             </w:pPr>
           </w:p>
         </w:tc>
@@ -1180,7 +1519,7 @@
             <w:pPr>
               <w:jc w:val="center"/>
               <w:rPr>
-                <w:rFonts w:ascii="Aptos Narrow" w:hAnsi="Aptos Narrow"/>
+                <w:rFonts w:ascii="Glacial Indifference" w:hAnsi="Glacial Indifference"/>
                 <w:color w:val="000000"/>
               </w:rPr>
             </w:pPr>
@@ -1195,7 +1534,7 @@
             <w:pPr>
               <w:jc w:val="center"/>
               <w:rPr>
-                <w:rFonts w:ascii="Aptos Narrow" w:hAnsi="Aptos Narrow"/>
+                <w:rFonts w:ascii="Glacial Indifference" w:hAnsi="Glacial Indifference"/>
                 <w:color w:val="000000"/>
               </w:rPr>
             </w:pPr>
@@ -1209,6 +1548,9 @@
           <w:p>
             <w:pPr>
               <w:jc w:val="center"/>
+              <w:rPr>
+                <w:rFonts w:ascii="Glacial Indifference" w:hAnsi="Glacial Indifference"/>
+              </w:rPr>
             </w:pPr>
           </w:p>
         </w:tc>
@@ -1221,6 +1563,7 @@
             <w:pPr>
               <w:jc w:val="center"/>
               <w:rPr>
+                <w:rFonts w:ascii="Glacial Indifference" w:hAnsi="Glacial Indifference"/>
                 <w:sz w:val="12"/>
                 <w:szCs w:val="12"/>
               </w:rPr>
@@ -1229,11 +1572,24 @@
         </w:tc>
       </w:tr>
     </w:tbl>
-    <w:p/>
-    <w:p/>
     <w:p>
       <w:pPr>
         <w:rPr>
+          <w:rFonts w:ascii="Glacial Indifference" w:hAnsi="Glacial Indifference"/>
+        </w:rPr>
+      </w:pPr>
+    </w:p>
+    <w:p>
+      <w:pPr>
+        <w:rPr>
+          <w:rFonts w:ascii="Glacial Indifference" w:hAnsi="Glacial Indifference"/>
+        </w:rPr>
+      </w:pPr>
+    </w:p>
+    <w:p>
+      <w:pPr>
+        <w:rPr>
+          <w:rFonts w:ascii="Glacial Indifference" w:hAnsi="Glacial Indifference"/>
           <w:b/>
           <w:bCs/>
           <w:u w:val="single"/>
@@ -1289,12 +1645,14 @@
   <w:p>
     <w:pPr>
       <w:rPr>
+        <w:rFonts w:ascii="Glacial Indifference" w:hAnsi="Glacial Indifference"/>
         <w:b/>
         <w:bCs/>
       </w:rPr>
     </w:pPr>
     <w:r>
       <w:rPr>
+        <w:rFonts w:ascii="Glacial Indifference" w:hAnsi="Glacial Indifference"/>
         <w:b/>
         <w:bCs/>
       </w:rPr>
@@ -1304,8 +1662,14 @@
   <w:p>
     <w:pPr>
       <w:jc w:val="both"/>
+      <w:rPr>
+        <w:rFonts w:ascii="Glacial Indifference" w:hAnsi="Glacial Indifference"/>
+      </w:rPr>
     </w:pPr>
     <w:r>
+      <w:rPr>
+        <w:rFonts w:ascii="Glacial Indifference" w:hAnsi="Glacial Indifference"/>
+      </w:rPr>
       <w:t xml:space="preserve">I am accountable for the equipment entrusted to me, and I will use it in the manner intended; I am expected to exercise due care in my use of this property; I will be responsible for any damage done; I will return the item(s) issued to me in proper working order); I will replace any items issued to me that are damaged, lost or stolen at my expense; I authorized a payroll deduction to cover the replacement cost of any items issued to me that is not returned for whatever reason, or is not returned in good working order. When I no longer need one or more of the items, I will return it/them immediately to the company. For work from home set up, I’m responsible for bringing the equipment to the office if it needs to be repaired. </w:t>
     </w:r>
   </w:p>
@@ -1331,12 +1695,14 @@
         <w:p>
           <w:pPr>
             <w:rPr>
+              <w:rFonts w:ascii="Glacial Indifference" w:hAnsi="Glacial Indifference"/>
               <w:b/>
               <w:bCs/>
             </w:rPr>
           </w:pPr>
           <w:r>
             <w:rPr>
+              <w:rFonts w:ascii="Glacial Indifference" w:hAnsi="Glacial Indifference"/>
               <w:b/>
               <w:bCs/>
             </w:rPr>
@@ -1349,7 +1715,85 @@
           <w:tcW w:w="5961" w:type="dxa"/>
         </w:tcPr>
         <w:p>
+          <w:pPr>
+            <w:rPr>
+              <w:rFonts w:ascii="Glacial Indifference" w:hAnsi="Glacial Indifference"/>
+            </w:rPr>
+          </w:pPr>
           <w:r>
+            <w:rPr>
+              <w:rFonts w:ascii="Glacial Indifference" w:hAnsi="Glacial Indifference"/>
+              <w:noProof/>
+            </w:rPr>
+            <w:drawing>
+              <wp:anchor distT="0" distB="0" distL="114300" distR="114300" simplePos="0" relativeHeight="251668480" behindDoc="1" locked="0" layoutInCell="1" allowOverlap="1" wp14:anchorId="2C5E909F" wp14:editId="25454608">
+                <wp:simplePos x="0" y="0"/>
+                <wp:positionH relativeFrom="page">
+                  <wp:posOffset>-15183</wp:posOffset>
+                </wp:positionH>
+                <wp:positionV relativeFrom="page">
+                  <wp:posOffset>-532206</wp:posOffset>
+                </wp:positionV>
+                <wp:extent cx="4203122" cy="2807335"/>
+                <wp:effectExtent l="0" t="0" r="6985" b="0"/>
+                <wp:wrapNone/>
+                <wp:docPr id="102207387" name="Picture 5"/>
+                <wp:cNvGraphicFramePr>
+                  <a:graphicFrameLocks xmlns:a="http://schemas.openxmlformats.org/drawingml/2006/main" noChangeAspect="1"/>
+                </wp:cNvGraphicFramePr>
+                <a:graphic xmlns:a="http://schemas.openxmlformats.org/drawingml/2006/main">
+                  <a:graphicData uri="http://schemas.openxmlformats.org/drawingml/2006/picture">
+                    <pic:pic xmlns:pic="http://schemas.openxmlformats.org/drawingml/2006/picture">
+                      <pic:nvPicPr>
+                        <pic:cNvPr id="801498607" name="Picture 801498607"/>
+                        <pic:cNvPicPr/>
+                      </pic:nvPicPr>
+                      <pic:blipFill rotWithShape="1">
+                        <a:blip r:embed="rId1">
+                          <a:extLst>
+                            <a:ext uri="{28A0092B-C50C-407E-A947-70E740481C1C}">
+                              <a14:useLocalDpi xmlns:a14="http://schemas.microsoft.com/office/drawing/2010/main" val="0"/>
+                            </a:ext>
+                          </a:extLst>
+                        </a:blip>
+                        <a:srcRect l="40731" t="72187" r="377"/>
+                        <a:stretch>
+                          <a:fillRect/>
+                        </a:stretch>
+                      </pic:blipFill>
+                      <pic:spPr bwMode="auto">
+                        <a:xfrm>
+                          <a:off x="0" y="0"/>
+                          <a:ext cx="4203122" cy="2807335"/>
+                        </a:xfrm>
+                        <a:prstGeom prst="rect">
+                          <a:avLst/>
+                        </a:prstGeom>
+                        <a:ln>
+                          <a:noFill/>
+                        </a:ln>
+                        <a:extLst>
+                          <a:ext uri="{53640926-AAD7-44D8-BBD7-CCE9431645EC}">
+                            <a14:shadowObscured xmlns:a14="http://schemas.microsoft.com/office/drawing/2010/main"/>
+                          </a:ext>
+                        </a:extLst>
+                      </pic:spPr>
+                    </pic:pic>
+                  </a:graphicData>
+                </a:graphic>
+                <wp14:sizeRelH relativeFrom="margin">
+                  <wp14:pctWidth>0</wp14:pctWidth>
+                </wp14:sizeRelH>
+                <wp14:sizeRelV relativeFrom="margin">
+                  <wp14:pctHeight>0</wp14:pctHeight>
+                </wp14:sizeRelV>
+              </wp:anchor>
+            </w:drawing>
+          </w:r>
+          <w:r>
+            <w:rPr>
+              <w:rFonts w:ascii="Glacial Indifference" w:hAnsi="Glacial Indifference"/>
+            </w:rPr>
             <w:t>John Albert Lago</w:t>
           </w:r>
         </w:p>
@@ -1366,12 +1810,14 @@
         <w:p>
           <w:pPr>
             <w:rPr>
+              <w:rFonts w:ascii="Glacial Indifference" w:hAnsi="Glacial Indifference"/>
               <w:b/>
               <w:bCs/>
             </w:rPr>
           </w:pPr>
           <w:r>
             <w:rPr>
+              <w:rFonts w:ascii="Glacial Indifference" w:hAnsi="Glacial Indifference"/>
               <w:b/>
               <w:bCs/>
             </w:rPr>
@@ -1384,8 +1830,14 @@
           <w:tcW w:w="5961" w:type="dxa"/>
         </w:tcPr>
         <w:p>
+          <w:pPr>
+            <w:rPr>
+              <w:rFonts w:ascii="Glacial Indifference" w:hAnsi="Glacial Indifference"/>
+            </w:rPr>
+          </w:pPr>
           <w:r>
             <w:rPr>
+              <w:rFonts w:ascii="Glacial Indifference" w:hAnsi="Glacial Indifference"/>
               <w:noProof/>
             </w:rPr>
             <w:drawing>
@@ -1412,7 +1864,7 @@
                         <pic:cNvPicPr/>
                       </pic:nvPicPr>
                       <pic:blipFill>
-                        <a:blip r:embed="rId1" cstate="print">
+                        <a:blip r:embed="rId2" cstate="print">
                           <a:extLst>
                             <a:ext uri="{28A0092B-C50C-407E-A947-70E740481C1C}">
                               <a14:useLocalDpi xmlns:a14="http://schemas.microsoft.com/office/drawing/2010/main" val="0"/>
@@ -1458,12 +1910,14 @@
         <w:p>
           <w:pPr>
             <w:rPr>
+              <w:rFonts w:ascii="Glacial Indifference" w:hAnsi="Glacial Indifference"/>
               <w:b/>
               <w:bCs/>
             </w:rPr>
           </w:pPr>
           <w:r>
             <w:rPr>
+              <w:rFonts w:ascii="Glacial Indifference" w:hAnsi="Glacial Indifference"/>
               <w:b/>
               <w:bCs/>
             </w:rPr>
@@ -1476,7 +1930,15 @@
           <w:tcW w:w="5961" w:type="dxa"/>
         </w:tcPr>
         <w:p>
+          <w:pPr>
+            <w:rPr>
+              <w:rFonts w:ascii="Glacial Indifference" w:hAnsi="Glacial Indifference"/>
+            </w:rPr>
+          </w:pPr>
           <w:r>
+            <w:rPr>
+              <w:rFonts w:ascii="Glacial Indifference" w:hAnsi="Glacial Indifference"/>
+            </w:rPr>
             <w:t>{name}</w:t>
           </w:r>
         </w:p>
@@ -1493,12 +1955,14 @@
         <w:p>
           <w:pPr>
             <w:rPr>
+              <w:rFonts w:ascii="Glacial Indifference" w:hAnsi="Glacial Indifference"/>
               <w:b/>
               <w:bCs/>
             </w:rPr>
           </w:pPr>
           <w:r>
             <w:rPr>
+              <w:rFonts w:ascii="Glacial Indifference" w:hAnsi="Glacial Indifference"/>
               <w:noProof/>
             </w:rPr>
             <w:drawing>
@@ -1525,10 +1989,10 @@
                         <pic:cNvPicPr/>
                       </pic:nvPicPr>
                       <pic:blipFill>
-                        <a:blip r:embed="rId2">
+                        <a:blip r:embed="rId3">
                           <a:extLst>
                             <a:ext uri="{96DAC541-7B7A-43D3-8B79-37D633B846F1}">
-                              <asvg:svgBlip xmlns:asvg="http://schemas.microsoft.com/office/drawing/2016/SVG/main" r:embed="rId3"/>
+                              <asvg:svgBlip xmlns:asvg="http://schemas.microsoft.com/office/drawing/2016/SVG/main" r:embed="rId4"/>
                             </a:ext>
                           </a:extLst>
                         </a:blip>
@@ -1553,6 +2017,7 @@
           </w:r>
           <w:r>
             <w:rPr>
+              <w:rFonts w:ascii="Glacial Indifference" w:hAnsi="Glacial Indifference"/>
               <w:noProof/>
             </w:rPr>
             <w:drawing>
@@ -1579,10 +2044,10 @@
                         <pic:cNvPicPr/>
                       </pic:nvPicPr>
                       <pic:blipFill>
-                        <a:blip r:embed="rId2">
+                        <a:blip r:embed="rId3">
                           <a:extLst>
                             <a:ext uri="{96DAC541-7B7A-43D3-8B79-37D633B846F1}">
-                              <asvg:svgBlip xmlns:asvg="http://schemas.microsoft.com/office/drawing/2016/SVG/main" r:embed="rId3"/>
+                              <asvg:svgBlip xmlns:asvg="http://schemas.microsoft.com/office/drawing/2016/SVG/main" r:embed="rId4"/>
                             </a:ext>
                           </a:extLst>
                         </a:blip>
@@ -1607,6 +2072,7 @@
           </w:r>
           <w:r>
             <w:rPr>
+              <w:rFonts w:ascii="Glacial Indifference" w:hAnsi="Glacial Indifference"/>
               <w:b/>
               <w:bCs/>
             </w:rPr>
@@ -1621,6 +2087,7 @@
         <w:p>
           <w:pPr>
             <w:rPr>
+              <w:rFonts w:ascii="Glacial Indifference" w:hAnsi="Glacial Indifference"/>
               <w:b/>
               <w:bCs/>
             </w:rPr>
@@ -1632,6 +2099,9 @@
   <w:p>
     <w:pPr>
       <w:pStyle w:val="Footer"/>
+      <w:rPr>
+        <w:rFonts w:ascii="Glacial Indifference" w:hAnsi="Glacial Indifference"/>
+      </w:rPr>
     </w:pPr>
   </w:p>
 </w:ftr>
@@ -1683,18 +2153,18 @@
         <w:noProof/>
       </w:rPr>
       <w:drawing>
-        <wp:anchor distT="0" distB="0" distL="114300" distR="114300" simplePos="0" relativeHeight="251658240" behindDoc="1" locked="0" layoutInCell="1" allowOverlap="1" wp14:anchorId="409AEB11" wp14:editId="69CA69F1">
+        <wp:anchor distT="0" distB="0" distL="114300" distR="114300" simplePos="0" relativeHeight="251666432" behindDoc="1" locked="0" layoutInCell="1" allowOverlap="1" wp14:anchorId="59DBA295" wp14:editId="39852F57">
           <wp:simplePos x="0" y="0"/>
-          <wp:positionH relativeFrom="page">
-            <wp:align>right</wp:align>
+          <wp:positionH relativeFrom="margin">
+            <wp:posOffset>5186150</wp:posOffset>
           </wp:positionH>
-          <wp:positionV relativeFrom="paragraph">
-            <wp:posOffset>-535640</wp:posOffset>
+          <wp:positionV relativeFrom="page">
+            <wp:align>top</wp:align>
           </wp:positionV>
-          <wp:extent cx="7772257" cy="10201275"/>
-          <wp:effectExtent l="0" t="0" r="635" b="0"/>
+          <wp:extent cx="2592070" cy="2743200"/>
+          <wp:effectExtent l="0" t="0" r="0" b="0"/>
           <wp:wrapNone/>
-          <wp:docPr id="468697842" name="Picture 3" descr="A white background with black dots&#10;&#10;Description automatically generated"/>
+          <wp:docPr id="1825370355" name="Picture 5"/>
           <wp:cNvGraphicFramePr>
             <a:graphicFrameLocks xmlns:a="http://schemas.openxmlformats.org/drawingml/2006/main" noChangeAspect="1"/>
           </wp:cNvGraphicFramePr>
@@ -1702,7 +2172,7 @@
             <a:graphicData uri="http://schemas.openxmlformats.org/drawingml/2006/picture">
               <pic:pic xmlns:pic="http://schemas.openxmlformats.org/drawingml/2006/picture">
                 <pic:nvPicPr>
-                  <pic:cNvPr id="468697842" name="Picture 3" descr="A white background with black dots&#10;&#10;Description automatically generated"/>
+                  <pic:cNvPr id="801498607" name="Picture 801498607"/>
                   <pic:cNvPicPr/>
                 </pic:nvPicPr>
                 <pic:blipFill rotWithShape="1">
@@ -1713,13 +2183,15 @@
                       </a:ext>
                     </a:extLst>
                   </a:blip>
-                  <a:srcRect t="6225"/>
-                  <a:stretch/>
+                  <a:srcRect l="63671" b="72819"/>
+                  <a:stretch>
+                    <a:fillRect/>
+                  </a:stretch>
                 </pic:blipFill>
                 <pic:spPr bwMode="auto">
                   <a:xfrm>
                     <a:off x="0" y="0"/>
-                    <a:ext cx="7772257" cy="10201275"/>
+                    <a:ext cx="2592070" cy="2743200"/>
                   </a:xfrm>
                   <a:prstGeom prst="rect">
                     <a:avLst/>
@@ -1736,10 +2208,70 @@
               </pic:pic>
             </a:graphicData>
           </a:graphic>
-          <wp14:sizeRelH relativeFrom="page">
+          <wp14:sizeRelH relativeFrom="margin">
             <wp14:pctWidth>0</wp14:pctWidth>
           </wp14:sizeRelH>
-          <wp14:sizeRelV relativeFrom="page">
+          <wp14:sizeRelV relativeFrom="margin">
+            <wp14:pctHeight>0</wp14:pctHeight>
+          </wp14:sizeRelV>
+        </wp:anchor>
+      </w:drawing>
+    </w:r>
+    <w:r>
+      <w:rPr>
+        <w:noProof/>
+      </w:rPr>
+      <w:drawing>
+        <wp:anchor distT="0" distB="0" distL="114300" distR="114300" simplePos="0" relativeHeight="251664384" behindDoc="1" locked="0" layoutInCell="1" allowOverlap="1" wp14:anchorId="31E1945F" wp14:editId="30839131">
+          <wp:simplePos x="0" y="0"/>
+          <wp:positionH relativeFrom="page">
+            <wp:align>left</wp:align>
+          </wp:positionH>
+          <wp:positionV relativeFrom="page">
+            <wp:align>top</wp:align>
+          </wp:positionV>
+          <wp:extent cx="7137400" cy="10208525"/>
+          <wp:effectExtent l="0" t="0" r="6350" b="2540"/>
+          <wp:wrapNone/>
+          <wp:docPr id="801498607" name="Picture 5"/>
+          <wp:cNvGraphicFramePr>
+            <a:graphicFrameLocks xmlns:a="http://schemas.openxmlformats.org/drawingml/2006/main" noChangeAspect="1"/>
+          </wp:cNvGraphicFramePr>
+          <a:graphic xmlns:a="http://schemas.openxmlformats.org/drawingml/2006/main">
+            <a:graphicData uri="http://schemas.openxmlformats.org/drawingml/2006/picture">
+              <pic:pic xmlns:pic="http://schemas.openxmlformats.org/drawingml/2006/picture">
+                <pic:nvPicPr>
+                  <pic:cNvPr id="801498607" name="Picture 801498607"/>
+                  <pic:cNvPicPr/>
+                </pic:nvPicPr>
+                <pic:blipFill>
+                  <a:blip r:embed="rId1">
+                    <a:extLst>
+                      <a:ext uri="{28A0092B-C50C-407E-A947-70E740481C1C}">
+                        <a14:useLocalDpi xmlns:a14="http://schemas.microsoft.com/office/drawing/2010/main" val="0"/>
+                      </a:ext>
+                    </a:extLst>
+                  </a:blip>
+                  <a:stretch>
+                    <a:fillRect/>
+                  </a:stretch>
+                </pic:blipFill>
+                <pic:spPr>
+                  <a:xfrm>
+                    <a:off x="0" y="0"/>
+                    <a:ext cx="7137400" cy="10208525"/>
+                  </a:xfrm>
+                  <a:prstGeom prst="rect">
+                    <a:avLst/>
+                  </a:prstGeom>
+                </pic:spPr>
+              </pic:pic>
+            </a:graphicData>
+          </a:graphic>
+          <wp14:sizeRelH relativeFrom="margin">
+            <wp14:pctWidth>0</wp14:pctWidth>
+          </wp14:sizeRelH>
+          <wp14:sizeRelV relativeFrom="margin">
             <wp14:pctHeight>0</wp14:pctHeight>
           </wp14:sizeRelV>
         </wp:anchor>

</xml_diff>

<commit_message>
fix: update client field label in Asset Accountability Form for consistency
</commit_message>
<xml_diff>
--- a/public/src/AccountabilityForms/ASSET ACCOUNTABILITY FORM - NEW ISSUE.docx
+++ b/public/src/AccountabilityForms/ASSET ACCOUNTABILITY FORM - NEW ISSUE.docx
@@ -573,31 +573,19 @@
         <w:t>STOCK</w:t>
       </w:r>
     </w:p>
-    <w:p>
-      <w:pPr>
-        <w:rPr>
-          <w:rFonts w:ascii="Glacial Indifference" w:hAnsi="Glacial Indifference"/>
-          <w:b/>
-          <w:bCs/>
-          <w:sz w:val="24"/>
-          <w:szCs w:val="24"/>
-          <w:u w:val="single"/>
-        </w:rPr>
-      </w:pPr>
-    </w:p>
     <w:tbl>
       <w:tblPr>
         <w:tblStyle w:val="TableGrid"/>
-        <w:tblW w:w="11340" w:type="dxa"/>
-        <w:tblInd w:w="137" w:type="dxa"/>
+        <w:tblpPr w:leftFromText="180" w:rightFromText="180" w:vertAnchor="text" w:horzAnchor="margin" w:tblpY="231"/>
+        <w:tblW w:w="9625" w:type="dxa"/>
         <w:tblLayout w:type="fixed"/>
         <w:tblLook w:val="04A0" w:firstRow="1" w:lastRow="0" w:firstColumn="1" w:lastColumn="0" w:noHBand="0" w:noVBand="1"/>
       </w:tblPr>
       <w:tblGrid>
-        <w:gridCol w:w="2037"/>
-        <w:gridCol w:w="2861"/>
-        <w:gridCol w:w="2615"/>
-        <w:gridCol w:w="3827"/>
+        <w:gridCol w:w="1525"/>
+        <w:gridCol w:w="3060"/>
+        <w:gridCol w:w="1350"/>
+        <w:gridCol w:w="3690"/>
       </w:tblGrid>
       <w:tr>
         <w:trPr>
@@ -605,7 +593,7 @@
         </w:trPr>
         <w:tc>
           <w:tcPr>
-            <w:tcW w:w="2037" w:type="dxa"/>
+            <w:tcW w:w="1525" w:type="dxa"/>
           </w:tcPr>
           <w:p>
             <w:pPr>
@@ -634,7 +622,7 @@
         </w:tc>
         <w:tc>
           <w:tcPr>
-            <w:tcW w:w="2861" w:type="dxa"/>
+            <w:tcW w:w="3060" w:type="dxa"/>
           </w:tcPr>
           <w:p>
             <w:pPr>
@@ -655,7 +643,7 @@
         </w:tc>
         <w:tc>
           <w:tcPr>
-            <w:tcW w:w="2615" w:type="dxa"/>
+            <w:tcW w:w="1350" w:type="dxa"/>
           </w:tcPr>
           <w:p>
             <w:pPr>
@@ -671,13 +659,13 @@
                 <w:b/>
                 <w:bCs/>
               </w:rPr>
-              <w:t>DEPARTMENT/CLIENT:</w:t>
+              <w:t>CLIENT:</w:t>
             </w:r>
           </w:p>
         </w:tc>
         <w:tc>
           <w:tcPr>
-            <w:tcW w:w="3827" w:type="dxa"/>
+            <w:tcW w:w="3690" w:type="dxa"/>
           </w:tcPr>
           <w:p>
             <w:pPr>
@@ -689,19 +677,7 @@
               <w:rPr>
                 <w:rFonts w:ascii="Glacial Indifference" w:hAnsi="Glacial Indifference"/>
               </w:rPr>
-              <w:t>{</w:t>
-            </w:r>
-            <w:r>
-              <w:rPr>
-                <w:rFonts w:ascii="Glacial Indifference" w:hAnsi="Glacial Indifference"/>
-              </w:rPr>
-              <w:t>department</w:t>
-            </w:r>
-            <w:r>
-              <w:rPr>
-                <w:rFonts w:ascii="Glacial Indifference" w:hAnsi="Glacial Indifference"/>
-              </w:rPr>
-              <w:t>}</w:t>
+              <w:t>{department}</w:t>
             </w:r>
           </w:p>
         </w:tc>
@@ -712,7 +688,7 @@
         </w:trPr>
         <w:tc>
           <w:tcPr>
-            <w:tcW w:w="2037" w:type="dxa"/>
+            <w:tcW w:w="1525" w:type="dxa"/>
           </w:tcPr>
           <w:p>
             <w:pPr>
@@ -741,7 +717,7 @@
         </w:tc>
         <w:tc>
           <w:tcPr>
-            <w:tcW w:w="2861" w:type="dxa"/>
+            <w:tcW w:w="3060" w:type="dxa"/>
           </w:tcPr>
           <w:p>
             <w:pPr>
@@ -773,7 +749,7 @@
         </w:tc>
         <w:tc>
           <w:tcPr>
-            <w:tcW w:w="2615" w:type="dxa"/>
+            <w:tcW w:w="1350" w:type="dxa"/>
           </w:tcPr>
           <w:p>
             <w:pPr>
@@ -795,7 +771,7 @@
         </w:tc>
         <w:tc>
           <w:tcPr>
-            <w:tcW w:w="3827" w:type="dxa"/>
+            <w:tcW w:w="3690" w:type="dxa"/>
           </w:tcPr>
           <w:p>
             <w:pPr>
@@ -809,6 +785,760 @@
               </w:rPr>
               <w:t>{position}</w:t>
             </w:r>
+          </w:p>
+        </w:tc>
+      </w:tr>
+    </w:tbl>
+    <w:tbl>
+      <w:tblPr>
+        <w:tblStyle w:val="TableGrid"/>
+        <w:tblpPr w:leftFromText="180" w:rightFromText="180" w:vertAnchor="text" w:horzAnchor="margin" w:tblpY="1259"/>
+        <w:tblW w:w="0" w:type="auto"/>
+        <w:tblLayout w:type="fixed"/>
+        <w:tblLook w:val="04A0" w:firstRow="1" w:lastRow="0" w:firstColumn="1" w:lastColumn="0" w:noHBand="0" w:noVBand="1"/>
+      </w:tblPr>
+      <w:tblGrid>
+        <w:gridCol w:w="1345"/>
+        <w:gridCol w:w="1620"/>
+        <w:gridCol w:w="1440"/>
+        <w:gridCol w:w="1980"/>
+        <w:gridCol w:w="1620"/>
+        <w:gridCol w:w="1345"/>
+      </w:tblGrid>
+      <w:tr>
+        <w:trPr>
+          <w:trHeight w:val="144"/>
+        </w:trPr>
+        <w:tc>
+          <w:tcPr>
+            <w:tcW w:w="1345" w:type="dxa"/>
+            <w:shd w:val="clear" w:color="auto" w:fill="323E4F" w:themeFill="text2" w:themeFillShade="BF"/>
+          </w:tcPr>
+          <w:p>
+            <w:pPr>
+              <w:jc w:val="center"/>
+              <w:rPr>
+                <w:rFonts w:ascii="Glacial Indifference" w:hAnsi="Glacial Indifference"/>
+                <w:b/>
+                <w:bCs/>
+                <w:color w:val="FFFFFF" w:themeColor="background1"/>
+              </w:rPr>
+            </w:pPr>
+            <w:r>
+              <w:rPr>
+                <w:rFonts w:ascii="Glacial Indifference" w:hAnsi="Glacial Indifference"/>
+                <w:b/>
+                <w:bCs/>
+                <w:color w:val="FFFFFF" w:themeColor="background1"/>
+              </w:rPr>
+              <w:t>DATE</w:t>
+            </w:r>
+          </w:p>
+        </w:tc>
+        <w:tc>
+          <w:tcPr>
+            <w:tcW w:w="1620" w:type="dxa"/>
+            <w:shd w:val="clear" w:color="auto" w:fill="323E4F" w:themeFill="text2" w:themeFillShade="BF"/>
+          </w:tcPr>
+          <w:p>
+            <w:pPr>
+              <w:jc w:val="center"/>
+              <w:rPr>
+                <w:rFonts w:ascii="Glacial Indifference" w:hAnsi="Glacial Indifference"/>
+                <w:b/>
+                <w:bCs/>
+                <w:color w:val="FFFFFF" w:themeColor="background1"/>
+              </w:rPr>
+            </w:pPr>
+            <w:r>
+              <w:rPr>
+                <w:rFonts w:ascii="Glacial Indifference" w:hAnsi="Glacial Indifference"/>
+                <w:b/>
+                <w:bCs/>
+                <w:color w:val="FFFFFF" w:themeColor="background1"/>
+              </w:rPr>
+              <w:t>DESCRIPTION</w:t>
+            </w:r>
+          </w:p>
+        </w:tc>
+        <w:tc>
+          <w:tcPr>
+            <w:tcW w:w="1440" w:type="dxa"/>
+            <w:shd w:val="clear" w:color="auto" w:fill="323E4F" w:themeFill="text2" w:themeFillShade="BF"/>
+          </w:tcPr>
+          <w:p>
+            <w:pPr>
+              <w:jc w:val="center"/>
+              <w:rPr>
+                <w:rFonts w:ascii="Glacial Indifference" w:hAnsi="Glacial Indifference"/>
+                <w:b/>
+                <w:bCs/>
+                <w:color w:val="FFFFFF" w:themeColor="background1"/>
+              </w:rPr>
+            </w:pPr>
+            <w:r>
+              <w:rPr>
+                <w:rFonts w:ascii="Glacial Indifference" w:hAnsi="Glacial Indifference"/>
+                <w:b/>
+                <w:bCs/>
+                <w:color w:val="FFFFFF" w:themeColor="background1"/>
+              </w:rPr>
+              <w:t>BRAND</w:t>
+            </w:r>
+          </w:p>
+        </w:tc>
+        <w:tc>
+          <w:tcPr>
+            <w:tcW w:w="1980" w:type="dxa"/>
+            <w:shd w:val="clear" w:color="auto" w:fill="323E4F" w:themeFill="text2" w:themeFillShade="BF"/>
+          </w:tcPr>
+          <w:p>
+            <w:pPr>
+              <w:jc w:val="center"/>
+              <w:rPr>
+                <w:rFonts w:ascii="Glacial Indifference" w:hAnsi="Glacial Indifference"/>
+                <w:b/>
+                <w:bCs/>
+                <w:color w:val="FFFFFF" w:themeColor="background1"/>
+              </w:rPr>
+            </w:pPr>
+            <w:r>
+              <w:rPr>
+                <w:rFonts w:ascii="Glacial Indifference" w:hAnsi="Glacial Indifference"/>
+                <w:b/>
+                <w:bCs/>
+                <w:color w:val="FFFFFF" w:themeColor="background1"/>
+              </w:rPr>
+              <w:t>SERIAL NUMBER</w:t>
+            </w:r>
+          </w:p>
+        </w:tc>
+        <w:tc>
+          <w:tcPr>
+            <w:tcW w:w="1620" w:type="dxa"/>
+            <w:shd w:val="clear" w:color="auto" w:fill="323E4F" w:themeFill="text2" w:themeFillShade="BF"/>
+          </w:tcPr>
+          <w:p>
+            <w:pPr>
+              <w:jc w:val="center"/>
+              <w:rPr>
+                <w:rFonts w:ascii="Glacial Indifference" w:hAnsi="Glacial Indifference"/>
+                <w:b/>
+                <w:bCs/>
+                <w:color w:val="FFFFFF" w:themeColor="background1"/>
+              </w:rPr>
+            </w:pPr>
+            <w:r>
+              <w:rPr>
+                <w:rFonts w:ascii="Glacial Indifference" w:hAnsi="Glacial Indifference"/>
+                <w:b/>
+                <w:bCs/>
+                <w:color w:val="FFFFFF" w:themeColor="background1"/>
+              </w:rPr>
+              <w:t>CONDITION</w:t>
+            </w:r>
+          </w:p>
+        </w:tc>
+        <w:tc>
+          <w:tcPr>
+            <w:tcW w:w="1345" w:type="dxa"/>
+            <w:shd w:val="clear" w:color="auto" w:fill="323E4F" w:themeFill="text2" w:themeFillShade="BF"/>
+          </w:tcPr>
+          <w:p>
+            <w:pPr>
+              <w:jc w:val="center"/>
+              <w:rPr>
+                <w:rFonts w:ascii="Glacial Indifference" w:hAnsi="Glacial Indifference"/>
+                <w:b/>
+                <w:bCs/>
+                <w:color w:val="FFFFFF" w:themeColor="background1"/>
+              </w:rPr>
+            </w:pPr>
+            <w:r>
+              <w:rPr>
+                <w:rFonts w:ascii="Glacial Indifference" w:hAnsi="Glacial Indifference"/>
+                <w:b/>
+                <w:bCs/>
+                <w:color w:val="FFFFFF" w:themeColor="background1"/>
+              </w:rPr>
+              <w:t>REMARKS</w:t>
+            </w:r>
+          </w:p>
+        </w:tc>
+      </w:tr>
+      <w:tr>
+        <w:trPr>
+          <w:trHeight w:val="217"/>
+        </w:trPr>
+        <w:tc>
+          <w:tcPr>
+            <w:tcW w:w="1345" w:type="dxa"/>
+            <w:vAlign w:val="center"/>
+          </w:tcPr>
+          <w:p>
+            <w:pPr>
+              <w:jc w:val="center"/>
+              <w:rPr>
+                <w:rFonts w:ascii="Glacial Indifference" w:hAnsi="Glacial Indifference"/>
+                <w:sz w:val="18"/>
+                <w:szCs w:val="18"/>
+              </w:rPr>
+            </w:pPr>
+            <w:r>
+              <w:rPr>
+                <w:rFonts w:ascii="Glacial Indifference" w:hAnsi="Glacial Indifference"/>
+                <w:sz w:val="16"/>
+                <w:szCs w:val="16"/>
+              </w:rPr>
+              <w:t>{#</w:t>
+            </w:r>
+            <w:proofErr w:type="gramStart"/>
+            <w:r>
+              <w:rPr>
+                <w:rFonts w:ascii="Glacial Indifference" w:hAnsi="Glacial Indifference"/>
+                <w:sz w:val="16"/>
+                <w:szCs w:val="16"/>
+              </w:rPr>
+              <w:t>devices}{</w:t>
+            </w:r>
+            <w:proofErr w:type="gramEnd"/>
+            <w:r>
+              <w:rPr>
+                <w:rFonts w:ascii="Glacial Indifference" w:hAnsi="Glacial Indifference"/>
+                <w:sz w:val="16"/>
+                <w:szCs w:val="16"/>
+              </w:rPr>
+              <w:t>assignmentDate}</w:t>
+            </w:r>
+          </w:p>
+        </w:tc>
+        <w:tc>
+          <w:tcPr>
+            <w:tcW w:w="1620" w:type="dxa"/>
+            <w:vAlign w:val="center"/>
+          </w:tcPr>
+          <w:p>
+            <w:pPr>
+              <w:jc w:val="center"/>
+              <w:rPr>
+                <w:rFonts w:ascii="Glacial Indifference" w:hAnsi="Glacial Indifference"/>
+              </w:rPr>
+            </w:pPr>
+            <w:r>
+              <w:rPr>
+                <w:rFonts w:ascii="Glacial Indifference" w:hAnsi="Glacial Indifference"/>
+              </w:rPr>
+              <w:t>{</w:t>
+            </w:r>
+            <w:proofErr w:type="spellStart"/>
+            <w:r>
+              <w:rPr>
+                <w:rFonts w:ascii="Glacial Indifference" w:hAnsi="Glacial Indifference"/>
+              </w:rPr>
+              <w:t>deviceType</w:t>
+            </w:r>
+            <w:proofErr w:type="spellEnd"/>
+            <w:r>
+              <w:rPr>
+                <w:rFonts w:ascii="Glacial Indifference" w:hAnsi="Glacial Indifference"/>
+              </w:rPr>
+              <w:t>}</w:t>
+            </w:r>
+          </w:p>
+        </w:tc>
+        <w:tc>
+          <w:tcPr>
+            <w:tcW w:w="1440" w:type="dxa"/>
+            <w:vAlign w:val="center"/>
+          </w:tcPr>
+          <w:p>
+            <w:pPr>
+              <w:jc w:val="center"/>
+              <w:rPr>
+                <w:rFonts w:ascii="Glacial Indifference" w:hAnsi="Glacial Indifference"/>
+              </w:rPr>
+            </w:pPr>
+            <w:r>
+              <w:rPr>
+                <w:rFonts w:ascii="Glacial Indifference" w:hAnsi="Glacial Indifference"/>
+              </w:rPr>
+              <w:t>{brand}</w:t>
+            </w:r>
+          </w:p>
+        </w:tc>
+        <w:tc>
+          <w:tcPr>
+            <w:tcW w:w="1980" w:type="dxa"/>
+            <w:vAlign w:val="center"/>
+          </w:tcPr>
+          <w:p>
+            <w:pPr>
+              <w:jc w:val="center"/>
+              <w:rPr>
+                <w:rFonts w:ascii="Glacial Indifference" w:hAnsi="Glacial Indifference"/>
+                <w:color w:val="000000"/>
+              </w:rPr>
+            </w:pPr>
+            <w:r>
+              <w:rPr>
+                <w:rFonts w:ascii="Glacial Indifference" w:hAnsi="Glacial Indifference"/>
+                <w:color w:val="000000"/>
+              </w:rPr>
+              <w:t>{</w:t>
+            </w:r>
+            <w:proofErr w:type="spellStart"/>
+            <w:r>
+              <w:rPr>
+                <w:rFonts w:ascii="Glacial Indifference" w:hAnsi="Glacial Indifference"/>
+                <w:color w:val="000000"/>
+              </w:rPr>
+              <w:t>deviceTag</w:t>
+            </w:r>
+            <w:proofErr w:type="spellEnd"/>
+            <w:r>
+              <w:rPr>
+                <w:rFonts w:ascii="Glacial Indifference" w:hAnsi="Glacial Indifference"/>
+                <w:color w:val="000000"/>
+              </w:rPr>
+              <w:t>}</w:t>
+            </w:r>
+          </w:p>
+        </w:tc>
+        <w:tc>
+          <w:tcPr>
+            <w:tcW w:w="1620" w:type="dxa"/>
+            <w:vAlign w:val="center"/>
+          </w:tcPr>
+          <w:p>
+            <w:pPr>
+              <w:jc w:val="center"/>
+              <w:rPr>
+                <w:rFonts w:ascii="Glacial Indifference" w:hAnsi="Glacial Indifference"/>
+              </w:rPr>
+            </w:pPr>
+            <w:r>
+              <w:rPr>
+                <w:rFonts w:ascii="Glacial Indifference" w:hAnsi="Glacial Indifference"/>
+              </w:rPr>
+              <w:t>{condition}</w:t>
+            </w:r>
+          </w:p>
+        </w:tc>
+        <w:tc>
+          <w:tcPr>
+            <w:tcW w:w="1345" w:type="dxa"/>
+            <w:vAlign w:val="center"/>
+          </w:tcPr>
+          <w:p>
+            <w:pPr>
+              <w:jc w:val="center"/>
+              <w:rPr>
+                <w:rFonts w:ascii="Glacial Indifference" w:hAnsi="Glacial Indifference"/>
+                <w:sz w:val="18"/>
+                <w:szCs w:val="18"/>
+              </w:rPr>
+            </w:pPr>
+            <w:proofErr w:type="gramStart"/>
+            <w:r>
+              <w:rPr>
+                <w:rFonts w:ascii="Glacial Indifference" w:hAnsi="Glacial Indifference"/>
+                <w:sz w:val="18"/>
+                <w:szCs w:val="18"/>
+              </w:rPr>
+              <w:t>{remarks}{/</w:t>
+            </w:r>
+            <w:proofErr w:type="gramEnd"/>
+            <w:r>
+              <w:rPr>
+                <w:rFonts w:ascii="Glacial Indifference" w:hAnsi="Glacial Indifference"/>
+                <w:sz w:val="18"/>
+                <w:szCs w:val="18"/>
+              </w:rPr>
+              <w:t>devices}</w:t>
+            </w:r>
+          </w:p>
+        </w:tc>
+      </w:tr>
+      <w:tr>
+        <w:trPr>
+          <w:trHeight w:val="347"/>
+        </w:trPr>
+        <w:tc>
+          <w:tcPr>
+            <w:tcW w:w="1345" w:type="dxa"/>
+            <w:vAlign w:val="center"/>
+          </w:tcPr>
+          <w:p>
+            <w:pPr>
+              <w:jc w:val="center"/>
+              <w:rPr>
+                <w:rFonts w:ascii="Glacial Indifference" w:hAnsi="Glacial Indifference"/>
+              </w:rPr>
+            </w:pPr>
+          </w:p>
+        </w:tc>
+        <w:tc>
+          <w:tcPr>
+            <w:tcW w:w="1620" w:type="dxa"/>
+            <w:vAlign w:val="center"/>
+          </w:tcPr>
+          <w:p>
+            <w:pPr>
+              <w:jc w:val="center"/>
+              <w:rPr>
+                <w:rFonts w:ascii="Glacial Indifference" w:hAnsi="Glacial Indifference"/>
+              </w:rPr>
+            </w:pPr>
+          </w:p>
+        </w:tc>
+        <w:tc>
+          <w:tcPr>
+            <w:tcW w:w="1440" w:type="dxa"/>
+            <w:vAlign w:val="center"/>
+          </w:tcPr>
+          <w:p>
+            <w:pPr>
+              <w:jc w:val="center"/>
+              <w:rPr>
+                <w:rFonts w:ascii="Glacial Indifference" w:hAnsi="Glacial Indifference"/>
+              </w:rPr>
+            </w:pPr>
+          </w:p>
+        </w:tc>
+        <w:tc>
+          <w:tcPr>
+            <w:tcW w:w="1980" w:type="dxa"/>
+            <w:vAlign w:val="center"/>
+          </w:tcPr>
+          <w:p>
+            <w:pPr>
+              <w:jc w:val="center"/>
+              <w:rPr>
+                <w:rFonts w:ascii="Glacial Indifference" w:hAnsi="Glacial Indifference"/>
+                <w:color w:val="000000"/>
+              </w:rPr>
+            </w:pPr>
+          </w:p>
+        </w:tc>
+        <w:tc>
+          <w:tcPr>
+            <w:tcW w:w="1620" w:type="dxa"/>
+            <w:vAlign w:val="center"/>
+          </w:tcPr>
+          <w:p>
+            <w:pPr>
+              <w:tabs>
+                <w:tab w:val="left" w:pos="795"/>
+                <w:tab w:val="left" w:pos="1395"/>
+              </w:tabs>
+              <w:jc w:val="center"/>
+              <w:rPr>
+                <w:rFonts w:ascii="Glacial Indifference" w:hAnsi="Glacial Indifference"/>
+              </w:rPr>
+            </w:pPr>
+          </w:p>
+        </w:tc>
+        <w:tc>
+          <w:tcPr>
+            <w:tcW w:w="1345" w:type="dxa"/>
+            <w:vAlign w:val="center"/>
+          </w:tcPr>
+          <w:p>
+            <w:pPr>
+              <w:jc w:val="center"/>
+              <w:rPr>
+                <w:rFonts w:ascii="Glacial Indifference" w:hAnsi="Glacial Indifference"/>
+                <w:sz w:val="20"/>
+                <w:szCs w:val="20"/>
+              </w:rPr>
+            </w:pPr>
+          </w:p>
+        </w:tc>
+      </w:tr>
+      <w:tr>
+        <w:trPr>
+          <w:trHeight w:val="347"/>
+        </w:trPr>
+        <w:tc>
+          <w:tcPr>
+            <w:tcW w:w="1345" w:type="dxa"/>
+            <w:vAlign w:val="center"/>
+          </w:tcPr>
+          <w:p>
+            <w:pPr>
+              <w:jc w:val="center"/>
+              <w:rPr>
+                <w:rFonts w:ascii="Glacial Indifference" w:hAnsi="Glacial Indifference"/>
+              </w:rPr>
+            </w:pPr>
+          </w:p>
+        </w:tc>
+        <w:tc>
+          <w:tcPr>
+            <w:tcW w:w="1620" w:type="dxa"/>
+            <w:vAlign w:val="center"/>
+          </w:tcPr>
+          <w:p>
+            <w:pPr>
+              <w:jc w:val="center"/>
+              <w:rPr>
+                <w:rFonts w:ascii="Glacial Indifference" w:hAnsi="Glacial Indifference"/>
+              </w:rPr>
+            </w:pPr>
+          </w:p>
+        </w:tc>
+        <w:tc>
+          <w:tcPr>
+            <w:tcW w:w="1440" w:type="dxa"/>
+            <w:vAlign w:val="center"/>
+          </w:tcPr>
+          <w:p>
+            <w:pPr>
+              <w:jc w:val="center"/>
+              <w:rPr>
+                <w:rFonts w:ascii="Glacial Indifference" w:hAnsi="Glacial Indifference"/>
+              </w:rPr>
+            </w:pPr>
+          </w:p>
+        </w:tc>
+        <w:tc>
+          <w:tcPr>
+            <w:tcW w:w="1980" w:type="dxa"/>
+            <w:vAlign w:val="center"/>
+          </w:tcPr>
+          <w:p>
+            <w:pPr>
+              <w:jc w:val="center"/>
+              <w:rPr>
+                <w:rFonts w:ascii="Glacial Indifference" w:hAnsi="Glacial Indifference"/>
+                <w:color w:val="000000"/>
+              </w:rPr>
+            </w:pPr>
+          </w:p>
+        </w:tc>
+        <w:tc>
+          <w:tcPr>
+            <w:tcW w:w="1620" w:type="dxa"/>
+            <w:vAlign w:val="center"/>
+          </w:tcPr>
+          <w:p>
+            <w:pPr>
+              <w:jc w:val="center"/>
+              <w:rPr>
+                <w:rFonts w:ascii="Glacial Indifference" w:hAnsi="Glacial Indifference"/>
+                <w:sz w:val="18"/>
+                <w:szCs w:val="18"/>
+              </w:rPr>
+            </w:pPr>
+          </w:p>
+        </w:tc>
+        <w:tc>
+          <w:tcPr>
+            <w:tcW w:w="1345" w:type="dxa"/>
+            <w:vAlign w:val="center"/>
+          </w:tcPr>
+          <w:p>
+            <w:pPr>
+              <w:jc w:val="center"/>
+              <w:rPr>
+                <w:rFonts w:ascii="Glacial Indifference" w:hAnsi="Glacial Indifference"/>
+                <w:sz w:val="20"/>
+                <w:szCs w:val="20"/>
+              </w:rPr>
+            </w:pPr>
+          </w:p>
+        </w:tc>
+      </w:tr>
+      <w:tr>
+        <w:trPr>
+          <w:trHeight w:val="347"/>
+        </w:trPr>
+        <w:tc>
+          <w:tcPr>
+            <w:tcW w:w="1345" w:type="dxa"/>
+            <w:vAlign w:val="center"/>
+          </w:tcPr>
+          <w:p>
+            <w:pPr>
+              <w:jc w:val="center"/>
+              <w:rPr>
+                <w:rFonts w:ascii="Glacial Indifference" w:hAnsi="Glacial Indifference"/>
+              </w:rPr>
+            </w:pPr>
+          </w:p>
+        </w:tc>
+        <w:tc>
+          <w:tcPr>
+            <w:tcW w:w="1620" w:type="dxa"/>
+            <w:vAlign w:val="center"/>
+          </w:tcPr>
+          <w:p>
+            <w:pPr>
+              <w:tabs>
+                <w:tab w:val="left" w:pos="322"/>
+              </w:tabs>
+              <w:jc w:val="center"/>
+              <w:rPr>
+                <w:rFonts w:ascii="Glacial Indifference" w:hAnsi="Glacial Indifference"/>
+              </w:rPr>
+            </w:pPr>
+          </w:p>
+        </w:tc>
+        <w:tc>
+          <w:tcPr>
+            <w:tcW w:w="1440" w:type="dxa"/>
+            <w:vAlign w:val="center"/>
+          </w:tcPr>
+          <w:p>
+            <w:pPr>
+              <w:jc w:val="center"/>
+              <w:rPr>
+                <w:rFonts w:ascii="Glacial Indifference" w:hAnsi="Glacial Indifference"/>
+              </w:rPr>
+            </w:pPr>
+          </w:p>
+        </w:tc>
+        <w:tc>
+          <w:tcPr>
+            <w:tcW w:w="1980" w:type="dxa"/>
+            <w:vAlign w:val="center"/>
+          </w:tcPr>
+          <w:p>
+            <w:pPr>
+              <w:jc w:val="center"/>
+              <w:rPr>
+                <w:rFonts w:ascii="Glacial Indifference" w:hAnsi="Glacial Indifference"/>
+                <w:color w:val="000000"/>
+              </w:rPr>
+            </w:pPr>
+          </w:p>
+        </w:tc>
+        <w:tc>
+          <w:tcPr>
+            <w:tcW w:w="1620" w:type="dxa"/>
+            <w:vAlign w:val="center"/>
+          </w:tcPr>
+          <w:p>
+            <w:pPr>
+              <w:jc w:val="center"/>
+              <w:rPr>
+                <w:rFonts w:ascii="Glacial Indifference" w:hAnsi="Glacial Indifference"/>
+                <w:sz w:val="18"/>
+                <w:szCs w:val="18"/>
+              </w:rPr>
+            </w:pPr>
+          </w:p>
+        </w:tc>
+        <w:tc>
+          <w:tcPr>
+            <w:tcW w:w="1345" w:type="dxa"/>
+            <w:vAlign w:val="center"/>
+          </w:tcPr>
+          <w:p>
+            <w:pPr>
+              <w:jc w:val="center"/>
+              <w:rPr>
+                <w:rFonts w:ascii="Glacial Indifference" w:hAnsi="Glacial Indifference"/>
+                <w:sz w:val="20"/>
+                <w:szCs w:val="20"/>
+              </w:rPr>
+            </w:pPr>
+          </w:p>
+        </w:tc>
+      </w:tr>
+      <w:tr>
+        <w:trPr>
+          <w:trHeight w:val="347"/>
+        </w:trPr>
+        <w:tc>
+          <w:tcPr>
+            <w:tcW w:w="1345" w:type="dxa"/>
+            <w:vAlign w:val="center"/>
+          </w:tcPr>
+          <w:p>
+            <w:pPr>
+              <w:jc w:val="center"/>
+              <w:rPr>
+                <w:rFonts w:ascii="Glacial Indifference" w:hAnsi="Glacial Indifference"/>
+              </w:rPr>
+            </w:pPr>
+          </w:p>
+        </w:tc>
+        <w:tc>
+          <w:tcPr>
+            <w:tcW w:w="1620" w:type="dxa"/>
+            <w:vAlign w:val="center"/>
+          </w:tcPr>
+          <w:p>
+            <w:pPr>
+              <w:tabs>
+                <w:tab w:val="left" w:pos="290"/>
+              </w:tabs>
+              <w:jc w:val="center"/>
+              <w:rPr>
+                <w:rFonts w:ascii="Glacial Indifference" w:hAnsi="Glacial Indifference"/>
+              </w:rPr>
+            </w:pPr>
+          </w:p>
+        </w:tc>
+        <w:tc>
+          <w:tcPr>
+            <w:tcW w:w="1440" w:type="dxa"/>
+            <w:vAlign w:val="center"/>
+          </w:tcPr>
+          <w:p>
+            <w:pPr>
+              <w:jc w:val="center"/>
+              <w:rPr>
+                <w:rFonts w:ascii="Glacial Indifference" w:hAnsi="Glacial Indifference"/>
+                <w:color w:val="000000"/>
+              </w:rPr>
+            </w:pPr>
+          </w:p>
+        </w:tc>
+        <w:tc>
+          <w:tcPr>
+            <w:tcW w:w="1980" w:type="dxa"/>
+            <w:vAlign w:val="center"/>
+          </w:tcPr>
+          <w:p>
+            <w:pPr>
+              <w:jc w:val="center"/>
+              <w:rPr>
+                <w:rFonts w:ascii="Glacial Indifference" w:hAnsi="Glacial Indifference"/>
+                <w:color w:val="000000"/>
+              </w:rPr>
+            </w:pPr>
+          </w:p>
+        </w:tc>
+        <w:tc>
+          <w:tcPr>
+            <w:tcW w:w="1620" w:type="dxa"/>
+            <w:vAlign w:val="center"/>
+          </w:tcPr>
+          <w:p>
+            <w:pPr>
+              <w:jc w:val="center"/>
+              <w:rPr>
+                <w:rFonts w:ascii="Glacial Indifference" w:hAnsi="Glacial Indifference"/>
+              </w:rPr>
+            </w:pPr>
+          </w:p>
+        </w:tc>
+        <w:tc>
+          <w:tcPr>
+            <w:tcW w:w="1345" w:type="dxa"/>
+            <w:vAlign w:val="center"/>
+          </w:tcPr>
+          <w:p>
+            <w:pPr>
+              <w:jc w:val="center"/>
+              <w:rPr>
+                <w:rFonts w:ascii="Glacial Indifference" w:hAnsi="Glacial Indifference"/>
+                <w:sz w:val="12"/>
+                <w:szCs w:val="12"/>
+              </w:rPr>
+            </w:pPr>
           </w:p>
         </w:tc>
       </w:tr>
@@ -820,758 +1550,6 @@
         </w:rPr>
       </w:pPr>
     </w:p>
-    <w:tbl>
-      <w:tblPr>
-        <w:tblStyle w:val="TableGrid"/>
-        <w:tblW w:w="11340" w:type="dxa"/>
-        <w:tblInd w:w="137" w:type="dxa"/>
-        <w:tblLayout w:type="fixed"/>
-        <w:tblLook w:val="04A0" w:firstRow="1" w:lastRow="0" w:firstColumn="1" w:lastColumn="0" w:noHBand="0" w:noVBand="1"/>
-      </w:tblPr>
-      <w:tblGrid>
-        <w:gridCol w:w="1701"/>
-        <w:gridCol w:w="1843"/>
-        <w:gridCol w:w="1984"/>
-        <w:gridCol w:w="2127"/>
-        <w:gridCol w:w="1842"/>
-        <w:gridCol w:w="1843"/>
-      </w:tblGrid>
-      <w:tr>
-        <w:trPr>
-          <w:trHeight w:val="341"/>
-        </w:trPr>
-        <w:tc>
-          <w:tcPr>
-            <w:tcW w:w="1701" w:type="dxa"/>
-          </w:tcPr>
-          <w:p>
-            <w:pPr>
-              <w:jc w:val="center"/>
-              <w:rPr>
-                <w:rFonts w:ascii="Glacial Indifference" w:hAnsi="Glacial Indifference"/>
-                <w:b/>
-                <w:bCs/>
-              </w:rPr>
-            </w:pPr>
-            <w:r>
-              <w:rPr>
-                <w:rFonts w:ascii="Glacial Indifference" w:hAnsi="Glacial Indifference"/>
-                <w:b/>
-                <w:bCs/>
-              </w:rPr>
-              <w:t>DATE</w:t>
-            </w:r>
-          </w:p>
-        </w:tc>
-        <w:tc>
-          <w:tcPr>
-            <w:tcW w:w="1843" w:type="dxa"/>
-          </w:tcPr>
-          <w:p>
-            <w:pPr>
-              <w:jc w:val="center"/>
-              <w:rPr>
-                <w:rFonts w:ascii="Glacial Indifference" w:hAnsi="Glacial Indifference"/>
-                <w:b/>
-                <w:bCs/>
-              </w:rPr>
-            </w:pPr>
-            <w:r>
-              <w:rPr>
-                <w:rFonts w:ascii="Glacial Indifference" w:hAnsi="Glacial Indifference"/>
-                <w:b/>
-                <w:bCs/>
-              </w:rPr>
-              <w:t>DESCRIPTION</w:t>
-            </w:r>
-          </w:p>
-        </w:tc>
-        <w:tc>
-          <w:tcPr>
-            <w:tcW w:w="1984" w:type="dxa"/>
-          </w:tcPr>
-          <w:p>
-            <w:pPr>
-              <w:jc w:val="center"/>
-              <w:rPr>
-                <w:rFonts w:ascii="Glacial Indifference" w:hAnsi="Glacial Indifference"/>
-                <w:b/>
-                <w:bCs/>
-              </w:rPr>
-            </w:pPr>
-            <w:r>
-              <w:rPr>
-                <w:rFonts w:ascii="Glacial Indifference" w:hAnsi="Glacial Indifference"/>
-                <w:b/>
-                <w:bCs/>
-              </w:rPr>
-              <w:t>BRAND</w:t>
-            </w:r>
-          </w:p>
-        </w:tc>
-        <w:tc>
-          <w:tcPr>
-            <w:tcW w:w="2127" w:type="dxa"/>
-          </w:tcPr>
-          <w:p>
-            <w:pPr>
-              <w:jc w:val="center"/>
-              <w:rPr>
-                <w:rFonts w:ascii="Glacial Indifference" w:hAnsi="Glacial Indifference"/>
-                <w:b/>
-                <w:bCs/>
-              </w:rPr>
-            </w:pPr>
-            <w:r>
-              <w:rPr>
-                <w:rFonts w:ascii="Glacial Indifference" w:hAnsi="Glacial Indifference"/>
-                <w:b/>
-                <w:bCs/>
-              </w:rPr>
-              <w:t>SERIAL NUMBER</w:t>
-            </w:r>
-          </w:p>
-        </w:tc>
-        <w:tc>
-          <w:tcPr>
-            <w:tcW w:w="1842" w:type="dxa"/>
-          </w:tcPr>
-          <w:p>
-            <w:pPr>
-              <w:jc w:val="center"/>
-              <w:rPr>
-                <w:rFonts w:ascii="Glacial Indifference" w:hAnsi="Glacial Indifference"/>
-                <w:b/>
-                <w:bCs/>
-              </w:rPr>
-            </w:pPr>
-            <w:r>
-              <w:rPr>
-                <w:rFonts w:ascii="Glacial Indifference" w:hAnsi="Glacial Indifference"/>
-                <w:b/>
-                <w:bCs/>
-              </w:rPr>
-              <w:t>CONDITION</w:t>
-            </w:r>
-          </w:p>
-        </w:tc>
-        <w:tc>
-          <w:tcPr>
-            <w:tcW w:w="1843" w:type="dxa"/>
-          </w:tcPr>
-          <w:p>
-            <w:pPr>
-              <w:jc w:val="center"/>
-              <w:rPr>
-                <w:rFonts w:ascii="Glacial Indifference" w:hAnsi="Glacial Indifference"/>
-                <w:b/>
-                <w:bCs/>
-              </w:rPr>
-            </w:pPr>
-            <w:r>
-              <w:rPr>
-                <w:rFonts w:ascii="Glacial Indifference" w:hAnsi="Glacial Indifference"/>
-                <w:b/>
-                <w:bCs/>
-              </w:rPr>
-              <w:t>REMARKS</w:t>
-            </w:r>
-          </w:p>
-        </w:tc>
-      </w:tr>
-      <w:tr>
-        <w:trPr>
-          <w:trHeight w:val="170"/>
-        </w:trPr>
-        <w:tc>
-          <w:tcPr>
-            <w:tcW w:w="1701" w:type="dxa"/>
-            <w:vAlign w:val="center"/>
-          </w:tcPr>
-          <w:p>
-            <w:pPr>
-              <w:jc w:val="center"/>
-              <w:rPr>
-                <w:rFonts w:ascii="Glacial Indifference" w:hAnsi="Glacial Indifference"/>
-                <w:sz w:val="18"/>
-                <w:szCs w:val="18"/>
-              </w:rPr>
-            </w:pPr>
-            <w:r>
-              <w:rPr>
-                <w:rFonts w:ascii="Glacial Indifference" w:hAnsi="Glacial Indifference"/>
-                <w:sz w:val="16"/>
-                <w:szCs w:val="16"/>
-              </w:rPr>
-              <w:t>{#</w:t>
-            </w:r>
-            <w:proofErr w:type="gramStart"/>
-            <w:r>
-              <w:rPr>
-                <w:rFonts w:ascii="Glacial Indifference" w:hAnsi="Glacial Indifference"/>
-                <w:sz w:val="16"/>
-                <w:szCs w:val="16"/>
-              </w:rPr>
-              <w:t>devices}</w:t>
-            </w:r>
-            <w:r>
-              <w:rPr>
-                <w:rFonts w:ascii="Glacial Indifference" w:hAnsi="Glacial Indifference"/>
-                <w:sz w:val="16"/>
-                <w:szCs w:val="16"/>
-              </w:rPr>
-              <w:t>{</w:t>
-            </w:r>
-            <w:proofErr w:type="gramEnd"/>
-            <w:r>
-              <w:rPr>
-                <w:rFonts w:ascii="Glacial Indifference" w:hAnsi="Glacial Indifference"/>
-                <w:sz w:val="16"/>
-                <w:szCs w:val="16"/>
-              </w:rPr>
-              <w:t>assignmentDate}</w:t>
-            </w:r>
-          </w:p>
-        </w:tc>
-        <w:tc>
-          <w:tcPr>
-            <w:tcW w:w="1843" w:type="dxa"/>
-            <w:vAlign w:val="center"/>
-          </w:tcPr>
-          <w:p>
-            <w:pPr>
-              <w:jc w:val="center"/>
-              <w:rPr>
-                <w:rFonts w:ascii="Glacial Indifference" w:hAnsi="Glacial Indifference"/>
-              </w:rPr>
-            </w:pPr>
-            <w:r>
-              <w:rPr>
-                <w:rFonts w:ascii="Glacial Indifference" w:hAnsi="Glacial Indifference"/>
-              </w:rPr>
-              <w:t>{</w:t>
-            </w:r>
-            <w:proofErr w:type="spellStart"/>
-            <w:r>
-              <w:rPr>
-                <w:rFonts w:ascii="Glacial Indifference" w:hAnsi="Glacial Indifference"/>
-              </w:rPr>
-              <w:t>deviceType</w:t>
-            </w:r>
-            <w:proofErr w:type="spellEnd"/>
-            <w:r>
-              <w:rPr>
-                <w:rFonts w:ascii="Glacial Indifference" w:hAnsi="Glacial Indifference"/>
-              </w:rPr>
-              <w:t>}</w:t>
-            </w:r>
-          </w:p>
-        </w:tc>
-        <w:tc>
-          <w:tcPr>
-            <w:tcW w:w="1984" w:type="dxa"/>
-            <w:vAlign w:val="center"/>
-          </w:tcPr>
-          <w:p>
-            <w:pPr>
-              <w:jc w:val="center"/>
-              <w:rPr>
-                <w:rFonts w:ascii="Glacial Indifference" w:hAnsi="Glacial Indifference"/>
-              </w:rPr>
-            </w:pPr>
-            <w:r>
-              <w:rPr>
-                <w:rFonts w:ascii="Glacial Indifference" w:hAnsi="Glacial Indifference"/>
-              </w:rPr>
-              <w:t>{brand}</w:t>
-            </w:r>
-          </w:p>
-        </w:tc>
-        <w:tc>
-          <w:tcPr>
-            <w:tcW w:w="2127" w:type="dxa"/>
-            <w:vAlign w:val="center"/>
-          </w:tcPr>
-          <w:p>
-            <w:pPr>
-              <w:jc w:val="center"/>
-              <w:rPr>
-                <w:rFonts w:ascii="Glacial Indifference" w:hAnsi="Glacial Indifference"/>
-                <w:color w:val="000000"/>
-              </w:rPr>
-            </w:pPr>
-            <w:r>
-              <w:rPr>
-                <w:rFonts w:ascii="Glacial Indifference" w:hAnsi="Glacial Indifference"/>
-                <w:color w:val="000000"/>
-              </w:rPr>
-              <w:t>{</w:t>
-            </w:r>
-            <w:proofErr w:type="spellStart"/>
-            <w:r>
-              <w:rPr>
-                <w:rFonts w:ascii="Glacial Indifference" w:hAnsi="Glacial Indifference"/>
-                <w:color w:val="000000"/>
-              </w:rPr>
-              <w:t>deviceTag</w:t>
-            </w:r>
-            <w:proofErr w:type="spellEnd"/>
-            <w:r>
-              <w:rPr>
-                <w:rFonts w:ascii="Glacial Indifference" w:hAnsi="Glacial Indifference"/>
-                <w:color w:val="000000"/>
-              </w:rPr>
-              <w:t>}</w:t>
-            </w:r>
-          </w:p>
-        </w:tc>
-        <w:tc>
-          <w:tcPr>
-            <w:tcW w:w="1842" w:type="dxa"/>
-            <w:vAlign w:val="center"/>
-          </w:tcPr>
-          <w:p>
-            <w:pPr>
-              <w:jc w:val="center"/>
-              <w:rPr>
-                <w:rFonts w:ascii="Glacial Indifference" w:hAnsi="Glacial Indifference"/>
-              </w:rPr>
-            </w:pPr>
-            <w:r>
-              <w:rPr>
-                <w:rFonts w:ascii="Glacial Indifference" w:hAnsi="Glacial Indifference"/>
-              </w:rPr>
-              <w:t>{condition}</w:t>
-            </w:r>
-          </w:p>
-        </w:tc>
-        <w:tc>
-          <w:tcPr>
-            <w:tcW w:w="1843" w:type="dxa"/>
-            <w:vAlign w:val="center"/>
-          </w:tcPr>
-          <w:p>
-            <w:pPr>
-              <w:jc w:val="center"/>
-              <w:rPr>
-                <w:rFonts w:ascii="Glacial Indifference" w:hAnsi="Glacial Indifference"/>
-                <w:sz w:val="18"/>
-                <w:szCs w:val="18"/>
-              </w:rPr>
-            </w:pPr>
-            <w:proofErr w:type="gramStart"/>
-            <w:r>
-              <w:rPr>
-                <w:rFonts w:ascii="Glacial Indifference" w:hAnsi="Glacial Indifference"/>
-                <w:sz w:val="18"/>
-                <w:szCs w:val="18"/>
-              </w:rPr>
-              <w:t>{remarks}</w:t>
-            </w:r>
-            <w:r>
-              <w:rPr>
-                <w:rFonts w:ascii="Glacial Indifference" w:hAnsi="Glacial Indifference"/>
-                <w:sz w:val="18"/>
-                <w:szCs w:val="18"/>
-              </w:rPr>
-              <w:t>{/</w:t>
-            </w:r>
-            <w:proofErr w:type="gramEnd"/>
-            <w:r>
-              <w:rPr>
-                <w:rFonts w:ascii="Glacial Indifference" w:hAnsi="Glacial Indifference"/>
-                <w:sz w:val="18"/>
-                <w:szCs w:val="18"/>
-              </w:rPr>
-              <w:t>devices}</w:t>
-            </w:r>
-          </w:p>
-        </w:tc>
-      </w:tr>
-      <w:tr>
-        <w:trPr>
-          <w:trHeight w:val="272"/>
-        </w:trPr>
-        <w:tc>
-          <w:tcPr>
-            <w:tcW w:w="1701" w:type="dxa"/>
-            <w:vAlign w:val="center"/>
-          </w:tcPr>
-          <w:p>
-            <w:pPr>
-              <w:jc w:val="center"/>
-              <w:rPr>
-                <w:rFonts w:ascii="Glacial Indifference" w:hAnsi="Glacial Indifference"/>
-              </w:rPr>
-            </w:pPr>
-          </w:p>
-        </w:tc>
-        <w:tc>
-          <w:tcPr>
-            <w:tcW w:w="1843" w:type="dxa"/>
-            <w:vAlign w:val="center"/>
-          </w:tcPr>
-          <w:p>
-            <w:pPr>
-              <w:jc w:val="center"/>
-              <w:rPr>
-                <w:rFonts w:ascii="Glacial Indifference" w:hAnsi="Glacial Indifference"/>
-              </w:rPr>
-            </w:pPr>
-          </w:p>
-        </w:tc>
-        <w:tc>
-          <w:tcPr>
-            <w:tcW w:w="1984" w:type="dxa"/>
-            <w:vAlign w:val="center"/>
-          </w:tcPr>
-          <w:p>
-            <w:pPr>
-              <w:jc w:val="center"/>
-              <w:rPr>
-                <w:rFonts w:ascii="Glacial Indifference" w:hAnsi="Glacial Indifference"/>
-              </w:rPr>
-            </w:pPr>
-          </w:p>
-        </w:tc>
-        <w:tc>
-          <w:tcPr>
-            <w:tcW w:w="2127" w:type="dxa"/>
-            <w:vAlign w:val="center"/>
-          </w:tcPr>
-          <w:p>
-            <w:pPr>
-              <w:jc w:val="center"/>
-              <w:rPr>
-                <w:rFonts w:ascii="Glacial Indifference" w:hAnsi="Glacial Indifference"/>
-                <w:color w:val="000000"/>
-              </w:rPr>
-            </w:pPr>
-          </w:p>
-        </w:tc>
-        <w:tc>
-          <w:tcPr>
-            <w:tcW w:w="1842" w:type="dxa"/>
-            <w:vAlign w:val="center"/>
-          </w:tcPr>
-          <w:p>
-            <w:pPr>
-              <w:tabs>
-                <w:tab w:val="left" w:pos="795"/>
-                <w:tab w:val="left" w:pos="1395"/>
-              </w:tabs>
-              <w:jc w:val="center"/>
-              <w:rPr>
-                <w:rFonts w:ascii="Glacial Indifference" w:hAnsi="Glacial Indifference"/>
-              </w:rPr>
-            </w:pPr>
-          </w:p>
-        </w:tc>
-        <w:tc>
-          <w:tcPr>
-            <w:tcW w:w="1843" w:type="dxa"/>
-            <w:vAlign w:val="center"/>
-          </w:tcPr>
-          <w:p>
-            <w:pPr>
-              <w:jc w:val="center"/>
-              <w:rPr>
-                <w:rFonts w:ascii="Glacial Indifference" w:hAnsi="Glacial Indifference"/>
-                <w:sz w:val="20"/>
-                <w:szCs w:val="20"/>
-              </w:rPr>
-            </w:pPr>
-          </w:p>
-        </w:tc>
-      </w:tr>
-      <w:tr>
-        <w:trPr>
-          <w:trHeight w:val="272"/>
-        </w:trPr>
-        <w:tc>
-          <w:tcPr>
-            <w:tcW w:w="1701" w:type="dxa"/>
-            <w:vAlign w:val="center"/>
-          </w:tcPr>
-          <w:p>
-            <w:pPr>
-              <w:jc w:val="center"/>
-              <w:rPr>
-                <w:rFonts w:ascii="Glacial Indifference" w:hAnsi="Glacial Indifference"/>
-              </w:rPr>
-            </w:pPr>
-          </w:p>
-        </w:tc>
-        <w:tc>
-          <w:tcPr>
-            <w:tcW w:w="1843" w:type="dxa"/>
-            <w:vAlign w:val="center"/>
-          </w:tcPr>
-          <w:p>
-            <w:pPr>
-              <w:jc w:val="center"/>
-              <w:rPr>
-                <w:rFonts w:ascii="Glacial Indifference" w:hAnsi="Glacial Indifference"/>
-              </w:rPr>
-            </w:pPr>
-          </w:p>
-        </w:tc>
-        <w:tc>
-          <w:tcPr>
-            <w:tcW w:w="1984" w:type="dxa"/>
-            <w:vAlign w:val="center"/>
-          </w:tcPr>
-          <w:p>
-            <w:pPr>
-              <w:jc w:val="center"/>
-              <w:rPr>
-                <w:rFonts w:ascii="Glacial Indifference" w:hAnsi="Glacial Indifference"/>
-              </w:rPr>
-            </w:pPr>
-          </w:p>
-        </w:tc>
-        <w:tc>
-          <w:tcPr>
-            <w:tcW w:w="2127" w:type="dxa"/>
-            <w:vAlign w:val="center"/>
-          </w:tcPr>
-          <w:p>
-            <w:pPr>
-              <w:jc w:val="center"/>
-              <w:rPr>
-                <w:rFonts w:ascii="Glacial Indifference" w:hAnsi="Glacial Indifference"/>
-                <w:color w:val="000000"/>
-              </w:rPr>
-            </w:pPr>
-          </w:p>
-        </w:tc>
-        <w:tc>
-          <w:tcPr>
-            <w:tcW w:w="1842" w:type="dxa"/>
-            <w:vAlign w:val="center"/>
-          </w:tcPr>
-          <w:p>
-            <w:pPr>
-              <w:jc w:val="center"/>
-              <w:rPr>
-                <w:rFonts w:ascii="Glacial Indifference" w:hAnsi="Glacial Indifference"/>
-                <w:sz w:val="18"/>
-                <w:szCs w:val="18"/>
-              </w:rPr>
-            </w:pPr>
-          </w:p>
-        </w:tc>
-        <w:tc>
-          <w:tcPr>
-            <w:tcW w:w="1843" w:type="dxa"/>
-            <w:vAlign w:val="center"/>
-          </w:tcPr>
-          <w:p>
-            <w:pPr>
-              <w:jc w:val="center"/>
-              <w:rPr>
-                <w:rFonts w:ascii="Glacial Indifference" w:hAnsi="Glacial Indifference"/>
-                <w:sz w:val="20"/>
-                <w:szCs w:val="20"/>
-              </w:rPr>
-            </w:pPr>
-          </w:p>
-        </w:tc>
-      </w:tr>
-      <w:tr>
-        <w:trPr>
-          <w:trHeight w:val="272"/>
-        </w:trPr>
-        <w:tc>
-          <w:tcPr>
-            <w:tcW w:w="1701" w:type="dxa"/>
-            <w:vAlign w:val="center"/>
-          </w:tcPr>
-          <w:p>
-            <w:pPr>
-              <w:jc w:val="center"/>
-              <w:rPr>
-                <w:rFonts w:ascii="Glacial Indifference" w:hAnsi="Glacial Indifference"/>
-              </w:rPr>
-            </w:pPr>
-          </w:p>
-        </w:tc>
-        <w:tc>
-          <w:tcPr>
-            <w:tcW w:w="1843" w:type="dxa"/>
-            <w:vAlign w:val="center"/>
-          </w:tcPr>
-          <w:p>
-            <w:pPr>
-              <w:tabs>
-                <w:tab w:val="left" w:pos="322"/>
-              </w:tabs>
-              <w:jc w:val="center"/>
-              <w:rPr>
-                <w:rFonts w:ascii="Glacial Indifference" w:hAnsi="Glacial Indifference"/>
-              </w:rPr>
-            </w:pPr>
-          </w:p>
-        </w:tc>
-        <w:tc>
-          <w:tcPr>
-            <w:tcW w:w="1984" w:type="dxa"/>
-            <w:vAlign w:val="center"/>
-          </w:tcPr>
-          <w:p>
-            <w:pPr>
-              <w:jc w:val="center"/>
-              <w:rPr>
-                <w:rFonts w:ascii="Glacial Indifference" w:hAnsi="Glacial Indifference"/>
-              </w:rPr>
-            </w:pPr>
-          </w:p>
-        </w:tc>
-        <w:tc>
-          <w:tcPr>
-            <w:tcW w:w="2127" w:type="dxa"/>
-            <w:vAlign w:val="center"/>
-          </w:tcPr>
-          <w:p>
-            <w:pPr>
-              <w:jc w:val="center"/>
-              <w:rPr>
-                <w:rFonts w:ascii="Glacial Indifference" w:hAnsi="Glacial Indifference"/>
-                <w:color w:val="000000"/>
-              </w:rPr>
-            </w:pPr>
-          </w:p>
-        </w:tc>
-        <w:tc>
-          <w:tcPr>
-            <w:tcW w:w="1842" w:type="dxa"/>
-            <w:vAlign w:val="center"/>
-          </w:tcPr>
-          <w:p>
-            <w:pPr>
-              <w:jc w:val="center"/>
-              <w:rPr>
-                <w:rFonts w:ascii="Glacial Indifference" w:hAnsi="Glacial Indifference"/>
-                <w:sz w:val="18"/>
-                <w:szCs w:val="18"/>
-              </w:rPr>
-            </w:pPr>
-          </w:p>
-        </w:tc>
-        <w:tc>
-          <w:tcPr>
-            <w:tcW w:w="1843" w:type="dxa"/>
-            <w:vAlign w:val="center"/>
-          </w:tcPr>
-          <w:p>
-            <w:pPr>
-              <w:jc w:val="center"/>
-              <w:rPr>
-                <w:rFonts w:ascii="Glacial Indifference" w:hAnsi="Glacial Indifference"/>
-                <w:sz w:val="20"/>
-                <w:szCs w:val="20"/>
-              </w:rPr>
-            </w:pPr>
-          </w:p>
-        </w:tc>
-      </w:tr>
-      <w:tr>
-        <w:trPr>
-          <w:trHeight w:val="272"/>
-        </w:trPr>
-        <w:tc>
-          <w:tcPr>
-            <w:tcW w:w="1701" w:type="dxa"/>
-            <w:vAlign w:val="center"/>
-          </w:tcPr>
-          <w:p>
-            <w:pPr>
-              <w:jc w:val="center"/>
-              <w:rPr>
-                <w:rFonts w:ascii="Glacial Indifference" w:hAnsi="Glacial Indifference"/>
-              </w:rPr>
-            </w:pPr>
-          </w:p>
-        </w:tc>
-        <w:tc>
-          <w:tcPr>
-            <w:tcW w:w="1843" w:type="dxa"/>
-            <w:vAlign w:val="center"/>
-          </w:tcPr>
-          <w:p>
-            <w:pPr>
-              <w:tabs>
-                <w:tab w:val="left" w:pos="290"/>
-              </w:tabs>
-              <w:jc w:val="center"/>
-              <w:rPr>
-                <w:rFonts w:ascii="Glacial Indifference" w:hAnsi="Glacial Indifference"/>
-              </w:rPr>
-            </w:pPr>
-          </w:p>
-        </w:tc>
-        <w:tc>
-          <w:tcPr>
-            <w:tcW w:w="1984" w:type="dxa"/>
-            <w:vAlign w:val="center"/>
-          </w:tcPr>
-          <w:p>
-            <w:pPr>
-              <w:jc w:val="center"/>
-              <w:rPr>
-                <w:rFonts w:ascii="Glacial Indifference" w:hAnsi="Glacial Indifference"/>
-                <w:color w:val="000000"/>
-              </w:rPr>
-            </w:pPr>
-          </w:p>
-        </w:tc>
-        <w:tc>
-          <w:tcPr>
-            <w:tcW w:w="2127" w:type="dxa"/>
-            <w:vAlign w:val="center"/>
-          </w:tcPr>
-          <w:p>
-            <w:pPr>
-              <w:jc w:val="center"/>
-              <w:rPr>
-                <w:rFonts w:ascii="Glacial Indifference" w:hAnsi="Glacial Indifference"/>
-                <w:color w:val="000000"/>
-              </w:rPr>
-            </w:pPr>
-          </w:p>
-        </w:tc>
-        <w:tc>
-          <w:tcPr>
-            <w:tcW w:w="1842" w:type="dxa"/>
-            <w:vAlign w:val="center"/>
-          </w:tcPr>
-          <w:p>
-            <w:pPr>
-              <w:jc w:val="center"/>
-              <w:rPr>
-                <w:rFonts w:ascii="Glacial Indifference" w:hAnsi="Glacial Indifference"/>
-              </w:rPr>
-            </w:pPr>
-          </w:p>
-        </w:tc>
-        <w:tc>
-          <w:tcPr>
-            <w:tcW w:w="1843" w:type="dxa"/>
-            <w:vAlign w:val="center"/>
-          </w:tcPr>
-          <w:p>
-            <w:pPr>
-              <w:jc w:val="center"/>
-              <w:rPr>
-                <w:rFonts w:ascii="Glacial Indifference" w:hAnsi="Glacial Indifference"/>
-                <w:sz w:val="12"/>
-                <w:szCs w:val="12"/>
-              </w:rPr>
-            </w:pPr>
-          </w:p>
-        </w:tc>
-      </w:tr>
-    </w:tbl>
     <w:p>
       <w:pPr>
         <w:rPr>
@@ -1593,6 +1571,13 @@
           <w:b/>
           <w:bCs/>
           <w:u w:val="single"/>
+        </w:rPr>
+      </w:pPr>
+    </w:p>
+    <w:p>
+      <w:pPr>
+        <w:rPr>
+          <w:rFonts w:ascii="Glacial Indifference" w:hAnsi="Glacial Indifference"/>
         </w:rPr>
       </w:pPr>
     </w:p>
@@ -1600,7 +1585,7 @@
       <w:headerReference w:type="default" r:id="rId8"/>
       <w:footerReference w:type="default" r:id="rId9"/>
       <w:pgSz w:w="12240" w:h="15840" w:code="1"/>
-      <w:pgMar w:top="720" w:right="340" w:bottom="170" w:left="340" w:header="720" w:footer="1417" w:gutter="0"/>
+      <w:pgMar w:top="1440" w:right="720" w:bottom="1440" w:left="2160" w:header="720" w:footer="864" w:gutter="0"/>
       <w:cols w:space="720"/>
       <w:docGrid w:linePitch="360"/>
     </w:sectPr>
@@ -1669,6 +1654,76 @@
     <w:r>
       <w:rPr>
         <w:rFonts w:ascii="Glacial Indifference" w:hAnsi="Glacial Indifference"/>
+        <w:noProof/>
+      </w:rPr>
+      <w:drawing>
+        <wp:anchor distT="0" distB="0" distL="114300" distR="114300" simplePos="0" relativeHeight="251668480" behindDoc="1" locked="0" layoutInCell="1" allowOverlap="1" wp14:anchorId="2C5E909F" wp14:editId="1DFCF1D4">
+          <wp:simplePos x="0" y="0"/>
+          <wp:positionH relativeFrom="page">
+            <wp:align>right</wp:align>
+          </wp:positionH>
+          <wp:positionV relativeFrom="page">
+            <wp:posOffset>7470140</wp:posOffset>
+          </wp:positionV>
+          <wp:extent cx="4203122" cy="2807335"/>
+          <wp:effectExtent l="0" t="0" r="6985" b="0"/>
+          <wp:wrapNone/>
+          <wp:docPr id="102207387" name="Picture 5"/>
+          <wp:cNvGraphicFramePr>
+            <a:graphicFrameLocks xmlns:a="http://schemas.openxmlformats.org/drawingml/2006/main" noChangeAspect="1"/>
+          </wp:cNvGraphicFramePr>
+          <a:graphic xmlns:a="http://schemas.openxmlformats.org/drawingml/2006/main">
+            <a:graphicData uri="http://schemas.openxmlformats.org/drawingml/2006/picture">
+              <pic:pic xmlns:pic="http://schemas.openxmlformats.org/drawingml/2006/picture">
+                <pic:nvPicPr>
+                  <pic:cNvPr id="801498607" name="Picture 801498607"/>
+                  <pic:cNvPicPr/>
+                </pic:nvPicPr>
+                <pic:blipFill rotWithShape="1">
+                  <a:blip r:embed="rId1">
+                    <a:extLst>
+                      <a:ext uri="{28A0092B-C50C-407E-A947-70E740481C1C}">
+                        <a14:useLocalDpi xmlns:a14="http://schemas.microsoft.com/office/drawing/2010/main" val="0"/>
+                      </a:ext>
+                    </a:extLst>
+                  </a:blip>
+                  <a:srcRect l="40731" t="72187" r="377"/>
+                  <a:stretch>
+                    <a:fillRect/>
+                  </a:stretch>
+                </pic:blipFill>
+                <pic:spPr bwMode="auto">
+                  <a:xfrm>
+                    <a:off x="0" y="0"/>
+                    <a:ext cx="4203122" cy="2807335"/>
+                  </a:xfrm>
+                  <a:prstGeom prst="rect">
+                    <a:avLst/>
+                  </a:prstGeom>
+                  <a:ln>
+                    <a:noFill/>
+                  </a:ln>
+                  <a:extLst>
+                    <a:ext uri="{53640926-AAD7-44D8-BBD7-CCE9431645EC}">
+                      <a14:shadowObscured xmlns:a14="http://schemas.microsoft.com/office/drawing/2010/main"/>
+                    </a:ext>
+                  </a:extLst>
+                </pic:spPr>
+              </pic:pic>
+            </a:graphicData>
+          </a:graphic>
+          <wp14:sizeRelH relativeFrom="margin">
+            <wp14:pctWidth>0</wp14:pctWidth>
+          </wp14:sizeRelH>
+          <wp14:sizeRelV relativeFrom="margin">
+            <wp14:pctHeight>0</wp14:pctHeight>
+          </wp14:sizeRelV>
+        </wp:anchor>
+      </w:drawing>
+    </w:r>
+    <w:r>
+      <w:rPr>
+        <w:rFonts w:ascii="Glacial Indifference" w:hAnsi="Glacial Indifference"/>
       </w:rPr>
       <w:t xml:space="preserve">I am accountable for the equipment entrusted to me, and I will use it in the manner intended; I am expected to exercise due care in my use of this property; I will be responsible for any damage done; I will return the item(s) issued to me in proper working order); I will replace any items issued to me that are damaged, lost or stolen at my expense; I authorized a payroll deduction to cover the replacement cost of any items issued to me that is not returned for whatever reason, or is not returned in good working order. When I no longer need one or more of the items, I will return it/them immediately to the company. For work from home set up, I’m responsible for bringing the equipment to the office if it needs to be repaired. </w:t>
     </w:r>
@@ -1681,8 +1736,8 @@
       <w:tblLook w:val="04A0" w:firstRow="1" w:lastRow="0" w:firstColumn="1" w:lastColumn="0" w:noHBand="0" w:noVBand="1"/>
     </w:tblPr>
     <w:tblGrid>
-      <w:gridCol w:w="5379"/>
-      <w:gridCol w:w="5961"/>
+      <w:gridCol w:w="4448"/>
+      <w:gridCol w:w="4765"/>
     </w:tblGrid>
     <w:tr>
       <w:trPr>
@@ -1720,76 +1775,6 @@
               <w:rFonts w:ascii="Glacial Indifference" w:hAnsi="Glacial Indifference"/>
             </w:rPr>
           </w:pPr>
-          <w:r>
-            <w:rPr>
-              <w:rFonts w:ascii="Glacial Indifference" w:hAnsi="Glacial Indifference"/>
-              <w:noProof/>
-            </w:rPr>
-            <w:drawing>
-              <wp:anchor distT="0" distB="0" distL="114300" distR="114300" simplePos="0" relativeHeight="251668480" behindDoc="1" locked="0" layoutInCell="1" allowOverlap="1" wp14:anchorId="2C5E909F" wp14:editId="25454608">
-                <wp:simplePos x="0" y="0"/>
-                <wp:positionH relativeFrom="page">
-                  <wp:posOffset>-15183</wp:posOffset>
-                </wp:positionH>
-                <wp:positionV relativeFrom="page">
-                  <wp:posOffset>-532206</wp:posOffset>
-                </wp:positionV>
-                <wp:extent cx="4203122" cy="2807335"/>
-                <wp:effectExtent l="0" t="0" r="6985" b="0"/>
-                <wp:wrapNone/>
-                <wp:docPr id="102207387" name="Picture 5"/>
-                <wp:cNvGraphicFramePr>
-                  <a:graphicFrameLocks xmlns:a="http://schemas.openxmlformats.org/drawingml/2006/main" noChangeAspect="1"/>
-                </wp:cNvGraphicFramePr>
-                <a:graphic xmlns:a="http://schemas.openxmlformats.org/drawingml/2006/main">
-                  <a:graphicData uri="http://schemas.openxmlformats.org/drawingml/2006/picture">
-                    <pic:pic xmlns:pic="http://schemas.openxmlformats.org/drawingml/2006/picture">
-                      <pic:nvPicPr>
-                        <pic:cNvPr id="801498607" name="Picture 801498607"/>
-                        <pic:cNvPicPr/>
-                      </pic:nvPicPr>
-                      <pic:blipFill rotWithShape="1">
-                        <a:blip r:embed="rId1">
-                          <a:extLst>
-                            <a:ext uri="{28A0092B-C50C-407E-A947-70E740481C1C}">
-                              <a14:useLocalDpi xmlns:a14="http://schemas.microsoft.com/office/drawing/2010/main" val="0"/>
-                            </a:ext>
-                          </a:extLst>
-                        </a:blip>
-                        <a:srcRect l="40731" t="72187" r="377"/>
-                        <a:stretch>
-                          <a:fillRect/>
-                        </a:stretch>
-                      </pic:blipFill>
-                      <pic:spPr bwMode="auto">
-                        <a:xfrm>
-                          <a:off x="0" y="0"/>
-                          <a:ext cx="4203122" cy="2807335"/>
-                        </a:xfrm>
-                        <a:prstGeom prst="rect">
-                          <a:avLst/>
-                        </a:prstGeom>
-                        <a:ln>
-                          <a:noFill/>
-                        </a:ln>
-                        <a:extLst>
-                          <a:ext uri="{53640926-AAD7-44D8-BBD7-CCE9431645EC}">
-                            <a14:shadowObscured xmlns:a14="http://schemas.microsoft.com/office/drawing/2010/main"/>
-                          </a:ext>
-                        </a:extLst>
-                      </pic:spPr>
-                    </pic:pic>
-                  </a:graphicData>
-                </a:graphic>
-                <wp14:sizeRelH relativeFrom="margin">
-                  <wp14:pctWidth>0</wp14:pctWidth>
-                </wp14:sizeRelH>
-                <wp14:sizeRelV relativeFrom="margin">
-                  <wp14:pctHeight>0</wp14:pctHeight>
-                </wp14:sizeRelV>
-              </wp:anchor>
-            </w:drawing>
-          </w:r>
           <w:r>
             <w:rPr>
               <w:rFonts w:ascii="Glacial Indifference" w:hAnsi="Glacial Indifference"/>
@@ -1835,6 +1820,66 @@
               <w:rFonts w:ascii="Glacial Indifference" w:hAnsi="Glacial Indifference"/>
             </w:rPr>
           </w:pPr>
+          <w:r>
+            <w:rPr>
+              <w:noProof/>
+            </w:rPr>
+            <w:drawing>
+              <wp:anchor distT="0" distB="0" distL="114300" distR="114300" simplePos="0" relativeHeight="251670528" behindDoc="1" locked="0" layoutInCell="1" allowOverlap="1" wp14:anchorId="7F7B451C" wp14:editId="7700693C">
+                <wp:simplePos x="0" y="0"/>
+                <wp:positionH relativeFrom="column">
+                  <wp:posOffset>-3175</wp:posOffset>
+                </wp:positionH>
+                <wp:positionV relativeFrom="paragraph">
+                  <wp:posOffset>-13335</wp:posOffset>
+                </wp:positionV>
+                <wp:extent cx="775300" cy="372923"/>
+                <wp:effectExtent l="0" t="0" r="6350" b="8255"/>
+                <wp:wrapNone/>
+                <wp:docPr id="1747871161" name="Picture 1" descr="A signature of a person&#10;&#10;AI-generated content may be incorrect."/>
+                <wp:cNvGraphicFramePr>
+                  <a:graphicFrameLocks xmlns:a="http://schemas.openxmlformats.org/drawingml/2006/main" noChangeAspect="1"/>
+                </wp:cNvGraphicFramePr>
+                <a:graphic xmlns:a="http://schemas.openxmlformats.org/drawingml/2006/main">
+                  <a:graphicData uri="http://schemas.openxmlformats.org/drawingml/2006/picture">
+                    <pic:pic xmlns:pic="http://schemas.openxmlformats.org/drawingml/2006/picture">
+                      <pic:nvPicPr>
+                        <pic:cNvPr id="1747871161" name="Picture 1" descr="A signature of a person&#10;&#10;AI-generated content may be incorrect."/>
+                        <pic:cNvPicPr/>
+                      </pic:nvPicPr>
+                      <pic:blipFill>
+                        <a:blip r:embed="rId2" cstate="print">
+                          <a:extLst>
+                            <a:ext uri="{28A0092B-C50C-407E-A947-70E740481C1C}">
+                              <a14:useLocalDpi xmlns:a14="http://schemas.microsoft.com/office/drawing/2010/main" val="0"/>
+                            </a:ext>
+                          </a:extLst>
+                        </a:blip>
+                        <a:stretch>
+                          <a:fillRect/>
+                        </a:stretch>
+                      </pic:blipFill>
+                      <pic:spPr>
+                        <a:xfrm>
+                          <a:off x="0" y="0"/>
+                          <a:ext cx="775300" cy="372923"/>
+                        </a:xfrm>
+                        <a:prstGeom prst="rect">
+                          <a:avLst/>
+                        </a:prstGeom>
+                      </pic:spPr>
+                    </pic:pic>
+                  </a:graphicData>
+                </a:graphic>
+                <wp14:sizeRelH relativeFrom="page">
+                  <wp14:pctWidth>0</wp14:pctWidth>
+                </wp14:sizeRelH>
+                <wp14:sizeRelV relativeFrom="page">
+                  <wp14:pctHeight>0</wp14:pctHeight>
+                </wp14:sizeRelV>
+              </wp:anchor>
+            </w:drawing>
+          </w:r>
           <w:r>
             <w:rPr>
               <w:rFonts w:ascii="Glacial Indifference" w:hAnsi="Glacial Indifference"/>
@@ -1963,116 +2008,6 @@
           <w:r>
             <w:rPr>
               <w:rFonts w:ascii="Glacial Indifference" w:hAnsi="Glacial Indifference"/>
-              <w:noProof/>
-            </w:rPr>
-            <w:drawing>
-              <wp:anchor distT="0" distB="0" distL="114300" distR="114300" simplePos="0" relativeHeight="251662336" behindDoc="0" locked="0" layoutInCell="1" allowOverlap="1" wp14:anchorId="421CB66C" wp14:editId="628F1923">
-                <wp:simplePos x="0" y="0"/>
-                <wp:positionH relativeFrom="column">
-                  <wp:posOffset>3123460</wp:posOffset>
-                </wp:positionH>
-                <wp:positionV relativeFrom="page">
-                  <wp:posOffset>76328</wp:posOffset>
-                </wp:positionV>
-                <wp:extent cx="137795" cy="137795"/>
-                <wp:effectExtent l="0" t="0" r="0" b="0"/>
-                <wp:wrapNone/>
-                <wp:docPr id="1560040253" name="Graphic 5" descr="Checkmark with solid fill"/>
-                <wp:cNvGraphicFramePr>
-                  <a:graphicFrameLocks xmlns:a="http://schemas.openxmlformats.org/drawingml/2006/main" noChangeAspect="1"/>
-                </wp:cNvGraphicFramePr>
-                <a:graphic xmlns:a="http://schemas.openxmlformats.org/drawingml/2006/main">
-                  <a:graphicData uri="http://schemas.openxmlformats.org/drawingml/2006/picture">
-                    <pic:pic xmlns:pic="http://schemas.openxmlformats.org/drawingml/2006/picture">
-                      <pic:nvPicPr>
-                        <pic:cNvPr id="1870380597" name="Graphic 1870380597" descr="Checkmark with solid fill"/>
-                        <pic:cNvPicPr/>
-                      </pic:nvPicPr>
-                      <pic:blipFill>
-                        <a:blip r:embed="rId3">
-                          <a:extLst>
-                            <a:ext uri="{96DAC541-7B7A-43D3-8B79-37D633B846F1}">
-                              <asvg:svgBlip xmlns:asvg="http://schemas.microsoft.com/office/drawing/2016/SVG/main" r:embed="rId4"/>
-                            </a:ext>
-                          </a:extLst>
-                        </a:blip>
-                        <a:stretch>
-                          <a:fillRect/>
-                        </a:stretch>
-                      </pic:blipFill>
-                      <pic:spPr>
-                        <a:xfrm>
-                          <a:off x="0" y="0"/>
-                          <a:ext cx="137795" cy="137795"/>
-                        </a:xfrm>
-                        <a:prstGeom prst="rect">
-                          <a:avLst/>
-                        </a:prstGeom>
-                      </pic:spPr>
-                    </pic:pic>
-                  </a:graphicData>
-                </a:graphic>
-              </wp:anchor>
-            </w:drawing>
-          </w:r>
-          <w:r>
-            <w:rPr>
-              <w:rFonts w:ascii="Glacial Indifference" w:hAnsi="Glacial Indifference"/>
-              <w:noProof/>
-            </w:rPr>
-            <w:drawing>
-              <wp:anchor distT="0" distB="0" distL="114300" distR="114300" simplePos="0" relativeHeight="251661312" behindDoc="0" locked="0" layoutInCell="1" allowOverlap="1" wp14:anchorId="26C42DA1" wp14:editId="4F175221">
-                <wp:simplePos x="0" y="0"/>
-                <wp:positionH relativeFrom="column">
-                  <wp:posOffset>3125775</wp:posOffset>
-                </wp:positionH>
-                <wp:positionV relativeFrom="page">
-                  <wp:posOffset>-207188</wp:posOffset>
-                </wp:positionV>
-                <wp:extent cx="137795" cy="137795"/>
-                <wp:effectExtent l="0" t="0" r="0" b="0"/>
-                <wp:wrapNone/>
-                <wp:docPr id="1280821509" name="Graphic 5" descr="Checkmark with solid fill"/>
-                <wp:cNvGraphicFramePr>
-                  <a:graphicFrameLocks xmlns:a="http://schemas.openxmlformats.org/drawingml/2006/main" noChangeAspect="1"/>
-                </wp:cNvGraphicFramePr>
-                <a:graphic xmlns:a="http://schemas.openxmlformats.org/drawingml/2006/main">
-                  <a:graphicData uri="http://schemas.openxmlformats.org/drawingml/2006/picture">
-                    <pic:pic xmlns:pic="http://schemas.openxmlformats.org/drawingml/2006/picture">
-                      <pic:nvPicPr>
-                        <pic:cNvPr id="1870380597" name="Graphic 1870380597" descr="Checkmark with solid fill"/>
-                        <pic:cNvPicPr/>
-                      </pic:nvPicPr>
-                      <pic:blipFill>
-                        <a:blip r:embed="rId3">
-                          <a:extLst>
-                            <a:ext uri="{96DAC541-7B7A-43D3-8B79-37D633B846F1}">
-                              <asvg:svgBlip xmlns:asvg="http://schemas.microsoft.com/office/drawing/2016/SVG/main" r:embed="rId4"/>
-                            </a:ext>
-                          </a:extLst>
-                        </a:blip>
-                        <a:stretch>
-                          <a:fillRect/>
-                        </a:stretch>
-                      </pic:blipFill>
-                      <pic:spPr>
-                        <a:xfrm>
-                          <a:off x="0" y="0"/>
-                          <a:ext cx="137795" cy="137795"/>
-                        </a:xfrm>
-                        <a:prstGeom prst="rect">
-                          <a:avLst/>
-                        </a:prstGeom>
-                      </pic:spPr>
-                    </pic:pic>
-                  </a:graphicData>
-                </a:graphic>
-              </wp:anchor>
-            </w:drawing>
-          </w:r>
-          <w:r>
-            <w:rPr>
-              <w:rFonts w:ascii="Glacial Indifference" w:hAnsi="Glacial Indifference"/>
               <w:b/>
               <w:bCs/>
             </w:rPr>
@@ -2144,6 +2079,11 @@
   <w:p>
     <w:pPr>
       <w:pStyle w:val="Header"/>
+      <w:tabs>
+        <w:tab w:val="clear" w:pos="4680"/>
+        <w:tab w:val="clear" w:pos="9360"/>
+        <w:tab w:val="left" w:pos="7545"/>
+      </w:tabs>
       <w:rPr>
         <w:noProof/>
       </w:rPr>
@@ -2153,13 +2093,73 @@
         <w:noProof/>
       </w:rPr>
       <w:drawing>
-        <wp:anchor distT="0" distB="0" distL="114300" distR="114300" simplePos="0" relativeHeight="251666432" behindDoc="1" locked="0" layoutInCell="1" allowOverlap="1" wp14:anchorId="59DBA295" wp14:editId="39852F57">
+        <wp:anchor distT="0" distB="0" distL="114300" distR="114300" simplePos="0" relativeHeight="251664384" behindDoc="1" locked="0" layoutInCell="1" allowOverlap="1" wp14:anchorId="31E1945F" wp14:editId="39ECC58C">
+          <wp:simplePos x="0" y="0"/>
+          <wp:positionH relativeFrom="page">
+            <wp:posOffset>-257175</wp:posOffset>
+          </wp:positionH>
+          <wp:positionV relativeFrom="page">
+            <wp:posOffset>-85725</wp:posOffset>
+          </wp:positionV>
+          <wp:extent cx="7658100" cy="10208260"/>
+          <wp:effectExtent l="0" t="0" r="0" b="2540"/>
+          <wp:wrapNone/>
+          <wp:docPr id="801498607" name="Picture 5"/>
+          <wp:cNvGraphicFramePr>
+            <a:graphicFrameLocks xmlns:a="http://schemas.openxmlformats.org/drawingml/2006/main" noChangeAspect="1"/>
+          </wp:cNvGraphicFramePr>
+          <a:graphic xmlns:a="http://schemas.openxmlformats.org/drawingml/2006/main">
+            <a:graphicData uri="http://schemas.openxmlformats.org/drawingml/2006/picture">
+              <pic:pic xmlns:pic="http://schemas.openxmlformats.org/drawingml/2006/picture">
+                <pic:nvPicPr>
+                  <pic:cNvPr id="801498607" name="Picture 801498607"/>
+                  <pic:cNvPicPr/>
+                </pic:nvPicPr>
+                <pic:blipFill>
+                  <a:blip r:embed="rId1">
+                    <a:extLst>
+                      <a:ext uri="{28A0092B-C50C-407E-A947-70E740481C1C}">
+                        <a14:useLocalDpi xmlns:a14="http://schemas.microsoft.com/office/drawing/2010/main" val="0"/>
+                      </a:ext>
+                    </a:extLst>
+                  </a:blip>
+                  <a:stretch>
+                    <a:fillRect/>
+                  </a:stretch>
+                </pic:blipFill>
+                <pic:spPr>
+                  <a:xfrm>
+                    <a:off x="0" y="0"/>
+                    <a:ext cx="7658100" cy="10208260"/>
+                  </a:xfrm>
+                  <a:prstGeom prst="rect">
+                    <a:avLst/>
+                  </a:prstGeom>
+                </pic:spPr>
+              </pic:pic>
+            </a:graphicData>
+          </a:graphic>
+          <wp14:sizeRelH relativeFrom="margin">
+            <wp14:pctWidth>0</wp14:pctWidth>
+          </wp14:sizeRelH>
+          <wp14:sizeRelV relativeFrom="margin">
+            <wp14:pctHeight>0</wp14:pctHeight>
+          </wp14:sizeRelV>
+        </wp:anchor>
+      </w:drawing>
+    </w:r>
+    <w:r>
+      <w:rPr>
+        <w:noProof/>
+      </w:rPr>
+      <w:drawing>
+        <wp:anchor distT="0" distB="0" distL="114300" distR="114300" simplePos="0" relativeHeight="251666432" behindDoc="1" locked="0" layoutInCell="1" allowOverlap="1" wp14:anchorId="59DBA295" wp14:editId="37DA724F">
           <wp:simplePos x="0" y="0"/>
           <wp:positionH relativeFrom="margin">
-            <wp:posOffset>5186150</wp:posOffset>
+            <wp:posOffset>3843020</wp:posOffset>
           </wp:positionH>
           <wp:positionV relativeFrom="page">
-            <wp:align>top</wp:align>
+            <wp:posOffset>-9525</wp:posOffset>
           </wp:positionV>
           <wp:extent cx="2592070" cy="2743200"/>
           <wp:effectExtent l="0" t="0" r="0" b="0"/>
@@ -2221,61 +2221,7 @@
       <w:rPr>
         <w:noProof/>
       </w:rPr>
-      <w:drawing>
-        <wp:anchor distT="0" distB="0" distL="114300" distR="114300" simplePos="0" relativeHeight="251664384" behindDoc="1" locked="0" layoutInCell="1" allowOverlap="1" wp14:anchorId="31E1945F" wp14:editId="30839131">
-          <wp:simplePos x="0" y="0"/>
-          <wp:positionH relativeFrom="page">
-            <wp:align>left</wp:align>
-          </wp:positionH>
-          <wp:positionV relativeFrom="page">
-            <wp:align>top</wp:align>
-          </wp:positionV>
-          <wp:extent cx="7137400" cy="10208525"/>
-          <wp:effectExtent l="0" t="0" r="6350" b="2540"/>
-          <wp:wrapNone/>
-          <wp:docPr id="801498607" name="Picture 5"/>
-          <wp:cNvGraphicFramePr>
-            <a:graphicFrameLocks xmlns:a="http://schemas.openxmlformats.org/drawingml/2006/main" noChangeAspect="1"/>
-          </wp:cNvGraphicFramePr>
-          <a:graphic xmlns:a="http://schemas.openxmlformats.org/drawingml/2006/main">
-            <a:graphicData uri="http://schemas.openxmlformats.org/drawingml/2006/picture">
-              <pic:pic xmlns:pic="http://schemas.openxmlformats.org/drawingml/2006/picture">
-                <pic:nvPicPr>
-                  <pic:cNvPr id="801498607" name="Picture 801498607"/>
-                  <pic:cNvPicPr/>
-                </pic:nvPicPr>
-                <pic:blipFill>
-                  <a:blip r:embed="rId1">
-                    <a:extLst>
-                      <a:ext uri="{28A0092B-C50C-407E-A947-70E740481C1C}">
-                        <a14:useLocalDpi xmlns:a14="http://schemas.microsoft.com/office/drawing/2010/main" val="0"/>
-                      </a:ext>
-                    </a:extLst>
-                  </a:blip>
-                  <a:stretch>
-                    <a:fillRect/>
-                  </a:stretch>
-                </pic:blipFill>
-                <pic:spPr>
-                  <a:xfrm>
-                    <a:off x="0" y="0"/>
-                    <a:ext cx="7137400" cy="10208525"/>
-                  </a:xfrm>
-                  <a:prstGeom prst="rect">
-                    <a:avLst/>
-                  </a:prstGeom>
-                </pic:spPr>
-              </pic:pic>
-            </a:graphicData>
-          </a:graphic>
-          <wp14:sizeRelH relativeFrom="margin">
-            <wp14:pctWidth>0</wp14:pctWidth>
-          </wp14:sizeRelH>
-          <wp14:sizeRelV relativeFrom="margin">
-            <wp14:pctHeight>0</wp14:pctHeight>
-          </wp14:sizeRelV>
-        </wp:anchor>
-      </w:drawing>
+      <w:tab/>
     </w:r>
   </w:p>
   <w:p>

</xml_diff>

<commit_message>
chore: update code structure for better readability and maintainability
</commit_message>
<xml_diff>
--- a/public/src/AccountabilityForms/ASSET ACCOUNTABILITY FORM - NEW ISSUE.docx
+++ b/public/src/AccountabilityForms/ASSET ACCOUNTABILITY FORM - NEW ISSUE.docx
@@ -793,17 +793,17 @@
       <w:tblPr>
         <w:tblStyle w:val="TableGrid"/>
         <w:tblpPr w:leftFromText="180" w:rightFromText="180" w:vertAnchor="text" w:horzAnchor="margin" w:tblpY="1259"/>
-        <w:tblW w:w="0" w:type="auto"/>
+        <w:tblW w:w="9625" w:type="dxa"/>
         <w:tblLayout w:type="fixed"/>
         <w:tblLook w:val="04A0" w:firstRow="1" w:lastRow="0" w:firstColumn="1" w:lastColumn="0" w:noHBand="0" w:noVBand="1"/>
       </w:tblPr>
       <w:tblGrid>
         <w:gridCol w:w="1345"/>
-        <w:gridCol w:w="1620"/>
+        <w:gridCol w:w="1800"/>
         <w:gridCol w:w="1440"/>
         <w:gridCol w:w="1980"/>
-        <w:gridCol w:w="1620"/>
-        <w:gridCol w:w="1345"/>
+        <w:gridCol w:w="1800"/>
+        <w:gridCol w:w="1260"/>
       </w:tblGrid>
       <w:tr>
         <w:trPr>
@@ -837,7 +837,7 @@
         </w:tc>
         <w:tc>
           <w:tcPr>
-            <w:tcW w:w="1620" w:type="dxa"/>
+            <w:tcW w:w="1800" w:type="dxa"/>
             <w:shd w:val="clear" w:color="auto" w:fill="323E4F" w:themeFill="text2" w:themeFillShade="BF"/>
           </w:tcPr>
           <w:p>
@@ -915,7 +915,7 @@
         </w:tc>
         <w:tc>
           <w:tcPr>
-            <w:tcW w:w="1620" w:type="dxa"/>
+            <w:tcW w:w="1800" w:type="dxa"/>
             <w:shd w:val="clear" w:color="auto" w:fill="323E4F" w:themeFill="text2" w:themeFillShade="BF"/>
           </w:tcPr>
           <w:p>
@@ -941,7 +941,7 @@
         </w:tc>
         <w:tc>
           <w:tcPr>
-            <w:tcW w:w="1345" w:type="dxa"/>
+            <w:tcW w:w="1260" w:type="dxa"/>
             <w:shd w:val="clear" w:color="auto" w:fill="323E4F" w:themeFill="text2" w:themeFillShade="BF"/>
           </w:tcPr>
           <w:p>
@@ -1014,7 +1014,7 @@
         </w:tc>
         <w:tc>
           <w:tcPr>
-            <w:tcW w:w="1620" w:type="dxa"/>
+            <w:tcW w:w="1800" w:type="dxa"/>
             <w:vAlign w:val="center"/>
           </w:tcPr>
           <w:p>
@@ -1106,7 +1106,7 @@
         </w:tc>
         <w:tc>
           <w:tcPr>
-            <w:tcW w:w="1620" w:type="dxa"/>
+            <w:tcW w:w="1800" w:type="dxa"/>
             <w:vAlign w:val="center"/>
           </w:tcPr>
           <w:p>
@@ -1126,7 +1126,7 @@
         </w:tc>
         <w:tc>
           <w:tcPr>
-            <w:tcW w:w="1345" w:type="dxa"/>
+            <w:tcW w:w="1260" w:type="dxa"/>
             <w:vAlign w:val="center"/>
           </w:tcPr>
           <w:p>
@@ -1179,7 +1179,7 @@
         </w:tc>
         <w:tc>
           <w:tcPr>
-            <w:tcW w:w="1620" w:type="dxa"/>
+            <w:tcW w:w="1800" w:type="dxa"/>
             <w:vAlign w:val="center"/>
           </w:tcPr>
           <w:p>
@@ -1222,7 +1222,7 @@
         </w:tc>
         <w:tc>
           <w:tcPr>
-            <w:tcW w:w="1620" w:type="dxa"/>
+            <w:tcW w:w="1800" w:type="dxa"/>
             <w:vAlign w:val="center"/>
           </w:tcPr>
           <w:p>
@@ -1240,7 +1240,7 @@
         </w:tc>
         <w:tc>
           <w:tcPr>
-            <w:tcW w:w="1345" w:type="dxa"/>
+            <w:tcW w:w="1260" w:type="dxa"/>
             <w:vAlign w:val="center"/>
           </w:tcPr>
           <w:p>
@@ -1275,7 +1275,7 @@
         </w:tc>
         <w:tc>
           <w:tcPr>
-            <w:tcW w:w="1620" w:type="dxa"/>
+            <w:tcW w:w="1800" w:type="dxa"/>
             <w:vAlign w:val="center"/>
           </w:tcPr>
           <w:p>
@@ -1318,7 +1318,7 @@
         </w:tc>
         <w:tc>
           <w:tcPr>
-            <w:tcW w:w="1620" w:type="dxa"/>
+            <w:tcW w:w="1800" w:type="dxa"/>
             <w:vAlign w:val="center"/>
           </w:tcPr>
           <w:p>
@@ -1334,7 +1334,7 @@
         </w:tc>
         <w:tc>
           <w:tcPr>
-            <w:tcW w:w="1345" w:type="dxa"/>
+            <w:tcW w:w="1260" w:type="dxa"/>
             <w:vAlign w:val="center"/>
           </w:tcPr>
           <w:p>
@@ -1369,7 +1369,7 @@
         </w:tc>
         <w:tc>
           <w:tcPr>
-            <w:tcW w:w="1620" w:type="dxa"/>
+            <w:tcW w:w="1800" w:type="dxa"/>
             <w:vAlign w:val="center"/>
           </w:tcPr>
           <w:p>
@@ -1415,7 +1415,7 @@
         </w:tc>
         <w:tc>
           <w:tcPr>
-            <w:tcW w:w="1620" w:type="dxa"/>
+            <w:tcW w:w="1800" w:type="dxa"/>
             <w:vAlign w:val="center"/>
           </w:tcPr>
           <w:p>
@@ -1431,7 +1431,7 @@
         </w:tc>
         <w:tc>
           <w:tcPr>
-            <w:tcW w:w="1345" w:type="dxa"/>
+            <w:tcW w:w="1260" w:type="dxa"/>
             <w:vAlign w:val="center"/>
           </w:tcPr>
           <w:p>
@@ -1466,7 +1466,7 @@
         </w:tc>
         <w:tc>
           <w:tcPr>
-            <w:tcW w:w="1620" w:type="dxa"/>
+            <w:tcW w:w="1800" w:type="dxa"/>
             <w:vAlign w:val="center"/>
           </w:tcPr>
           <w:p>
@@ -1513,7 +1513,7 @@
         </w:tc>
         <w:tc>
           <w:tcPr>
-            <w:tcW w:w="1620" w:type="dxa"/>
+            <w:tcW w:w="1800" w:type="dxa"/>
             <w:vAlign w:val="center"/>
           </w:tcPr>
           <w:p>
@@ -1527,7 +1527,7 @@
         </w:tc>
         <w:tc>
           <w:tcPr>
-            <w:tcW w:w="1345" w:type="dxa"/>
+            <w:tcW w:w="1260" w:type="dxa"/>
             <w:vAlign w:val="center"/>
           </w:tcPr>
           <w:p>
@@ -1571,6 +1571,20 @@
           <w:b/>
           <w:bCs/>
           <w:u w:val="single"/>
+        </w:rPr>
+      </w:pPr>
+    </w:p>
+    <w:p>
+      <w:pPr>
+        <w:rPr>
+          <w:rFonts w:ascii="Glacial Indifference" w:hAnsi="Glacial Indifference"/>
+        </w:rPr>
+      </w:pPr>
+    </w:p>
+    <w:p>
+      <w:pPr>
+        <w:rPr>
+          <w:rFonts w:ascii="Glacial Indifference" w:hAnsi="Glacial Indifference"/>
         </w:rPr>
       </w:pPr>
     </w:p>
@@ -1633,6 +1647,8 @@
         <w:rFonts w:ascii="Glacial Indifference" w:hAnsi="Glacial Indifference"/>
         <w:b/>
         <w:bCs/>
+        <w:sz w:val="18"/>
+        <w:szCs w:val="18"/>
       </w:rPr>
     </w:pPr>
     <w:r>
@@ -1640,6 +1656,8 @@
         <w:rFonts w:ascii="Glacial Indifference" w:hAnsi="Glacial Indifference"/>
         <w:b/>
         <w:bCs/>
+        <w:sz w:val="18"/>
+        <w:szCs w:val="18"/>
       </w:rPr>
       <w:t>By Signing this Form, I agree to the following:</w:t>
     </w:r>
@@ -1649,12 +1667,16 @@
       <w:jc w:val="both"/>
       <w:rPr>
         <w:rFonts w:ascii="Glacial Indifference" w:hAnsi="Glacial Indifference"/>
+        <w:sz w:val="18"/>
+        <w:szCs w:val="18"/>
       </w:rPr>
     </w:pPr>
     <w:r>
       <w:rPr>
         <w:rFonts w:ascii="Glacial Indifference" w:hAnsi="Glacial Indifference"/>
         <w:noProof/>
+        <w:sz w:val="18"/>
+        <w:szCs w:val="18"/>
       </w:rPr>
       <w:drawing>
         <wp:anchor distT="0" distB="0" distL="114300" distR="114300" simplePos="0" relativeHeight="251668480" behindDoc="1" locked="0" layoutInCell="1" allowOverlap="1" wp14:anchorId="2C5E909F" wp14:editId="1DFCF1D4">
@@ -1724,6 +1746,8 @@
     <w:r>
       <w:rPr>
         <w:rFonts w:ascii="Glacial Indifference" w:hAnsi="Glacial Indifference"/>
+        <w:sz w:val="18"/>
+        <w:szCs w:val="18"/>
       </w:rPr>
       <w:t xml:space="preserve">I am accountable for the equipment entrusted to me, and I will use it in the manner intended; I am expected to exercise due care in my use of this property; I will be responsible for any damage done; I will return the item(s) issued to me in proper working order); I will replace any items issued to me that are damaged, lost or stolen at my expense; I authorized a payroll deduction to cover the replacement cost of any items issued to me that is not returned for whatever reason, or is not returned in good working order. When I no longer need one or more of the items, I will return it/them immediately to the company. For work from home set up, I’m responsible for bringing the equipment to the office if it needs to be repaired. </w:t>
     </w:r>
@@ -2093,13 +2117,13 @@
         <w:noProof/>
       </w:rPr>
       <w:drawing>
-        <wp:anchor distT="0" distB="0" distL="114300" distR="114300" simplePos="0" relativeHeight="251664384" behindDoc="1" locked="0" layoutInCell="1" allowOverlap="1" wp14:anchorId="31E1945F" wp14:editId="39ECC58C">
+        <wp:anchor distT="0" distB="0" distL="114300" distR="114300" simplePos="0" relativeHeight="251664384" behindDoc="1" locked="0" layoutInCell="1" allowOverlap="1" wp14:anchorId="31E1945F" wp14:editId="72F9F8B5">
           <wp:simplePos x="0" y="0"/>
           <wp:positionH relativeFrom="page">
             <wp:posOffset>-257175</wp:posOffset>
           </wp:positionH>
           <wp:positionV relativeFrom="page">
-            <wp:posOffset>-85725</wp:posOffset>
+            <wp:posOffset>-161925</wp:posOffset>
           </wp:positionV>
           <wp:extent cx="7658100" cy="10208260"/>
           <wp:effectExtent l="0" t="0" r="0" b="2540"/>

</xml_diff>

<commit_message>
chore: remove unnecessary whitespace from asset accountability forms
</commit_message>
<xml_diff>
--- a/public/src/AccountabilityForms/ASSET ACCOUNTABILITY FORM - NEW ISSUE.docx
+++ b/public/src/AccountabilityForms/ASSET ACCOUNTABILITY FORM - NEW ISSUE.docx
@@ -1156,389 +1156,6 @@
               </w:rPr>
               <w:t>devices}</w:t>
             </w:r>
-          </w:p>
-        </w:tc>
-      </w:tr>
-      <w:tr>
-        <w:trPr>
-          <w:trHeight w:val="347"/>
-        </w:trPr>
-        <w:tc>
-          <w:tcPr>
-            <w:tcW w:w="1345" w:type="dxa"/>
-            <w:vAlign w:val="center"/>
-          </w:tcPr>
-          <w:p>
-            <w:pPr>
-              <w:jc w:val="center"/>
-              <w:rPr>
-                <w:rFonts w:ascii="Glacial Indifference" w:hAnsi="Glacial Indifference"/>
-              </w:rPr>
-            </w:pPr>
-          </w:p>
-        </w:tc>
-        <w:tc>
-          <w:tcPr>
-            <w:tcW w:w="1800" w:type="dxa"/>
-            <w:vAlign w:val="center"/>
-          </w:tcPr>
-          <w:p>
-            <w:pPr>
-              <w:jc w:val="center"/>
-              <w:rPr>
-                <w:rFonts w:ascii="Glacial Indifference" w:hAnsi="Glacial Indifference"/>
-              </w:rPr>
-            </w:pPr>
-          </w:p>
-        </w:tc>
-        <w:tc>
-          <w:tcPr>
-            <w:tcW w:w="1440" w:type="dxa"/>
-            <w:vAlign w:val="center"/>
-          </w:tcPr>
-          <w:p>
-            <w:pPr>
-              <w:jc w:val="center"/>
-              <w:rPr>
-                <w:rFonts w:ascii="Glacial Indifference" w:hAnsi="Glacial Indifference"/>
-              </w:rPr>
-            </w:pPr>
-          </w:p>
-        </w:tc>
-        <w:tc>
-          <w:tcPr>
-            <w:tcW w:w="1980" w:type="dxa"/>
-            <w:vAlign w:val="center"/>
-          </w:tcPr>
-          <w:p>
-            <w:pPr>
-              <w:jc w:val="center"/>
-              <w:rPr>
-                <w:rFonts w:ascii="Glacial Indifference" w:hAnsi="Glacial Indifference"/>
-                <w:color w:val="000000"/>
-              </w:rPr>
-            </w:pPr>
-          </w:p>
-        </w:tc>
-        <w:tc>
-          <w:tcPr>
-            <w:tcW w:w="1800" w:type="dxa"/>
-            <w:vAlign w:val="center"/>
-          </w:tcPr>
-          <w:p>
-            <w:pPr>
-              <w:tabs>
-                <w:tab w:val="left" w:pos="795"/>
-                <w:tab w:val="left" w:pos="1395"/>
-              </w:tabs>
-              <w:jc w:val="center"/>
-              <w:rPr>
-                <w:rFonts w:ascii="Glacial Indifference" w:hAnsi="Glacial Indifference"/>
-              </w:rPr>
-            </w:pPr>
-          </w:p>
-        </w:tc>
-        <w:tc>
-          <w:tcPr>
-            <w:tcW w:w="1260" w:type="dxa"/>
-            <w:vAlign w:val="center"/>
-          </w:tcPr>
-          <w:p>
-            <w:pPr>
-              <w:jc w:val="center"/>
-              <w:rPr>
-                <w:rFonts w:ascii="Glacial Indifference" w:hAnsi="Glacial Indifference"/>
-                <w:sz w:val="20"/>
-                <w:szCs w:val="20"/>
-              </w:rPr>
-            </w:pPr>
-          </w:p>
-        </w:tc>
-      </w:tr>
-      <w:tr>
-        <w:trPr>
-          <w:trHeight w:val="347"/>
-        </w:trPr>
-        <w:tc>
-          <w:tcPr>
-            <w:tcW w:w="1345" w:type="dxa"/>
-            <w:vAlign w:val="center"/>
-          </w:tcPr>
-          <w:p>
-            <w:pPr>
-              <w:jc w:val="center"/>
-              <w:rPr>
-                <w:rFonts w:ascii="Glacial Indifference" w:hAnsi="Glacial Indifference"/>
-              </w:rPr>
-            </w:pPr>
-          </w:p>
-        </w:tc>
-        <w:tc>
-          <w:tcPr>
-            <w:tcW w:w="1800" w:type="dxa"/>
-            <w:vAlign w:val="center"/>
-          </w:tcPr>
-          <w:p>
-            <w:pPr>
-              <w:jc w:val="center"/>
-              <w:rPr>
-                <w:rFonts w:ascii="Glacial Indifference" w:hAnsi="Glacial Indifference"/>
-              </w:rPr>
-            </w:pPr>
-          </w:p>
-        </w:tc>
-        <w:tc>
-          <w:tcPr>
-            <w:tcW w:w="1440" w:type="dxa"/>
-            <w:vAlign w:val="center"/>
-          </w:tcPr>
-          <w:p>
-            <w:pPr>
-              <w:jc w:val="center"/>
-              <w:rPr>
-                <w:rFonts w:ascii="Glacial Indifference" w:hAnsi="Glacial Indifference"/>
-              </w:rPr>
-            </w:pPr>
-          </w:p>
-        </w:tc>
-        <w:tc>
-          <w:tcPr>
-            <w:tcW w:w="1980" w:type="dxa"/>
-            <w:vAlign w:val="center"/>
-          </w:tcPr>
-          <w:p>
-            <w:pPr>
-              <w:jc w:val="center"/>
-              <w:rPr>
-                <w:rFonts w:ascii="Glacial Indifference" w:hAnsi="Glacial Indifference"/>
-                <w:color w:val="000000"/>
-              </w:rPr>
-            </w:pPr>
-          </w:p>
-        </w:tc>
-        <w:tc>
-          <w:tcPr>
-            <w:tcW w:w="1800" w:type="dxa"/>
-            <w:vAlign w:val="center"/>
-          </w:tcPr>
-          <w:p>
-            <w:pPr>
-              <w:jc w:val="center"/>
-              <w:rPr>
-                <w:rFonts w:ascii="Glacial Indifference" w:hAnsi="Glacial Indifference"/>
-                <w:sz w:val="18"/>
-                <w:szCs w:val="18"/>
-              </w:rPr>
-            </w:pPr>
-          </w:p>
-        </w:tc>
-        <w:tc>
-          <w:tcPr>
-            <w:tcW w:w="1260" w:type="dxa"/>
-            <w:vAlign w:val="center"/>
-          </w:tcPr>
-          <w:p>
-            <w:pPr>
-              <w:jc w:val="center"/>
-              <w:rPr>
-                <w:rFonts w:ascii="Glacial Indifference" w:hAnsi="Glacial Indifference"/>
-                <w:sz w:val="20"/>
-                <w:szCs w:val="20"/>
-              </w:rPr>
-            </w:pPr>
-          </w:p>
-        </w:tc>
-      </w:tr>
-      <w:tr>
-        <w:trPr>
-          <w:trHeight w:val="347"/>
-        </w:trPr>
-        <w:tc>
-          <w:tcPr>
-            <w:tcW w:w="1345" w:type="dxa"/>
-            <w:vAlign w:val="center"/>
-          </w:tcPr>
-          <w:p>
-            <w:pPr>
-              <w:jc w:val="center"/>
-              <w:rPr>
-                <w:rFonts w:ascii="Glacial Indifference" w:hAnsi="Glacial Indifference"/>
-              </w:rPr>
-            </w:pPr>
-          </w:p>
-        </w:tc>
-        <w:tc>
-          <w:tcPr>
-            <w:tcW w:w="1800" w:type="dxa"/>
-            <w:vAlign w:val="center"/>
-          </w:tcPr>
-          <w:p>
-            <w:pPr>
-              <w:tabs>
-                <w:tab w:val="left" w:pos="322"/>
-              </w:tabs>
-              <w:jc w:val="center"/>
-              <w:rPr>
-                <w:rFonts w:ascii="Glacial Indifference" w:hAnsi="Glacial Indifference"/>
-              </w:rPr>
-            </w:pPr>
-          </w:p>
-        </w:tc>
-        <w:tc>
-          <w:tcPr>
-            <w:tcW w:w="1440" w:type="dxa"/>
-            <w:vAlign w:val="center"/>
-          </w:tcPr>
-          <w:p>
-            <w:pPr>
-              <w:jc w:val="center"/>
-              <w:rPr>
-                <w:rFonts w:ascii="Glacial Indifference" w:hAnsi="Glacial Indifference"/>
-              </w:rPr>
-            </w:pPr>
-          </w:p>
-        </w:tc>
-        <w:tc>
-          <w:tcPr>
-            <w:tcW w:w="1980" w:type="dxa"/>
-            <w:vAlign w:val="center"/>
-          </w:tcPr>
-          <w:p>
-            <w:pPr>
-              <w:jc w:val="center"/>
-              <w:rPr>
-                <w:rFonts w:ascii="Glacial Indifference" w:hAnsi="Glacial Indifference"/>
-                <w:color w:val="000000"/>
-              </w:rPr>
-            </w:pPr>
-          </w:p>
-        </w:tc>
-        <w:tc>
-          <w:tcPr>
-            <w:tcW w:w="1800" w:type="dxa"/>
-            <w:vAlign w:val="center"/>
-          </w:tcPr>
-          <w:p>
-            <w:pPr>
-              <w:jc w:val="center"/>
-              <w:rPr>
-                <w:rFonts w:ascii="Glacial Indifference" w:hAnsi="Glacial Indifference"/>
-                <w:sz w:val="18"/>
-                <w:szCs w:val="18"/>
-              </w:rPr>
-            </w:pPr>
-          </w:p>
-        </w:tc>
-        <w:tc>
-          <w:tcPr>
-            <w:tcW w:w="1260" w:type="dxa"/>
-            <w:vAlign w:val="center"/>
-          </w:tcPr>
-          <w:p>
-            <w:pPr>
-              <w:jc w:val="center"/>
-              <w:rPr>
-                <w:rFonts w:ascii="Glacial Indifference" w:hAnsi="Glacial Indifference"/>
-                <w:sz w:val="20"/>
-                <w:szCs w:val="20"/>
-              </w:rPr>
-            </w:pPr>
-          </w:p>
-        </w:tc>
-      </w:tr>
-      <w:tr>
-        <w:trPr>
-          <w:trHeight w:val="347"/>
-        </w:trPr>
-        <w:tc>
-          <w:tcPr>
-            <w:tcW w:w="1345" w:type="dxa"/>
-            <w:vAlign w:val="center"/>
-          </w:tcPr>
-          <w:p>
-            <w:pPr>
-              <w:jc w:val="center"/>
-              <w:rPr>
-                <w:rFonts w:ascii="Glacial Indifference" w:hAnsi="Glacial Indifference"/>
-              </w:rPr>
-            </w:pPr>
-          </w:p>
-        </w:tc>
-        <w:tc>
-          <w:tcPr>
-            <w:tcW w:w="1800" w:type="dxa"/>
-            <w:vAlign w:val="center"/>
-          </w:tcPr>
-          <w:p>
-            <w:pPr>
-              <w:tabs>
-                <w:tab w:val="left" w:pos="290"/>
-              </w:tabs>
-              <w:jc w:val="center"/>
-              <w:rPr>
-                <w:rFonts w:ascii="Glacial Indifference" w:hAnsi="Glacial Indifference"/>
-              </w:rPr>
-            </w:pPr>
-          </w:p>
-        </w:tc>
-        <w:tc>
-          <w:tcPr>
-            <w:tcW w:w="1440" w:type="dxa"/>
-            <w:vAlign w:val="center"/>
-          </w:tcPr>
-          <w:p>
-            <w:pPr>
-              <w:jc w:val="center"/>
-              <w:rPr>
-                <w:rFonts w:ascii="Glacial Indifference" w:hAnsi="Glacial Indifference"/>
-                <w:color w:val="000000"/>
-              </w:rPr>
-            </w:pPr>
-          </w:p>
-        </w:tc>
-        <w:tc>
-          <w:tcPr>
-            <w:tcW w:w="1980" w:type="dxa"/>
-            <w:vAlign w:val="center"/>
-          </w:tcPr>
-          <w:p>
-            <w:pPr>
-              <w:jc w:val="center"/>
-              <w:rPr>
-                <w:rFonts w:ascii="Glacial Indifference" w:hAnsi="Glacial Indifference"/>
-                <w:color w:val="000000"/>
-              </w:rPr>
-            </w:pPr>
-          </w:p>
-        </w:tc>
-        <w:tc>
-          <w:tcPr>
-            <w:tcW w:w="1800" w:type="dxa"/>
-            <w:vAlign w:val="center"/>
-          </w:tcPr>
-          <w:p>
-            <w:pPr>
-              <w:jc w:val="center"/>
-              <w:rPr>
-                <w:rFonts w:ascii="Glacial Indifference" w:hAnsi="Glacial Indifference"/>
-              </w:rPr>
-            </w:pPr>
-          </w:p>
-        </w:tc>
-        <w:tc>
-          <w:tcPr>
-            <w:tcW w:w="1260" w:type="dxa"/>
-            <w:vAlign w:val="center"/>
-          </w:tcPr>
-          <w:p>
-            <w:pPr>
-              <w:jc w:val="center"/>
-              <w:rPr>
-                <w:rFonts w:ascii="Glacial Indifference" w:hAnsi="Glacial Indifference"/>
-                <w:sz w:val="12"/>
-                <w:szCs w:val="12"/>
-              </w:rPr>
-            </w:pPr>
           </w:p>
         </w:tc>
       </w:tr>

</xml_diff>